<commit_message>
- Added technician scheduling info page
</commit_message>
<xml_diff>
--- a/aw_chapter_7_template.docx
+++ b/aw_chapter_7_template.docx
@@ -144,6 +144,11 @@
       </w:r>
     </w:p>
     <w:p>
+      <w:r>
+        <w:br w:type="page"/>
+      </w:r>
+    </w:p>
+    <w:p>
       <w:pPr>
         <w:pStyle w:val="ListParagraph"/>
         <w:numPr>
@@ -152,6 +157,7 @@
         </w:numPr>
       </w:pPr>
       <w:r>
+        <w:lastRenderedPageBreak/>
         <w:t>Technician menu screen</w:t>
       </w:r>
       <w:r>
@@ -163,7 +169,6 @@
         <w:pStyle w:val="ListParagraph"/>
       </w:pPr>
       <w:r>
-        <w:lastRenderedPageBreak/>
         <w:drawing>
           <wp:inline distT="0" distB="0" distL="0" distR="0" wp14:anchorId="67B8365B" wp14:editId="2E0B4EA5">
             <wp:extent cx="5943600" cy="4476750"/>
@@ -258,6 +263,11 @@
     </w:p>
     <w:p/>
     <w:p>
+      <w:r>
+        <w:br w:type="page"/>
+      </w:r>
+    </w:p>
+    <w:p>
       <w:pPr>
         <w:pStyle w:val="ListParagraph"/>
         <w:numPr>
@@ -266,6 +276,7 @@
         </w:numPr>
       </w:pPr>
       <w:r>
+        <w:lastRenderedPageBreak/>
         <w:t>Request a Service Call screen:</w:t>
       </w:r>
     </w:p>
@@ -279,7 +290,6 @@
         <w:pStyle w:val="ListParagraph"/>
       </w:pPr>
       <w:r>
-        <w:lastRenderedPageBreak/>
         <w:drawing>
           <wp:inline distT="0" distB="0" distL="0" distR="0" wp14:anchorId="01074AD8" wp14:editId="12E85373">
             <wp:extent cx="5943600" cy="4429125"/>
@@ -358,7 +368,15 @@
         </w:numPr>
       </w:pPr>
       <w:r>
-        <w:t>Email address must be in the form username@domain, where domain must have a top-level domain extension, such as .com.</w:t>
+        <w:t xml:space="preserve">Email address must be in the form </w:t>
+      </w:r>
+      <w:proofErr w:type="spellStart"/>
+      <w:r>
+        <w:t>username@domain</w:t>
+      </w:r>
+      <w:proofErr w:type="spellEnd"/>
+      <w:r>
+        <w:t>, where domain must have a top-level domain extension, such as .com.</w:t>
       </w:r>
     </w:p>
     <w:p>
@@ -369,8 +387,13 @@
           <w:numId w:val="1"/>
         </w:numPr>
       </w:pPr>
+      <w:proofErr w:type="gramStart"/>
       <w:r>
-        <w:t>State may only be chosen from a finite list of states where service is available, which is selected from a dropdown list. The user may not define options outside of those provided.</w:t>
+        <w:t>State</w:t>
+      </w:r>
+      <w:proofErr w:type="gramEnd"/>
+      <w:r>
+        <w:t xml:space="preserve"> may only be chosen from a finite list of states where service is available, which is selected from a dropdown list. The user may not define options outside of those provided.</w:t>
       </w:r>
     </w:p>
     <w:p>
@@ -385,7 +408,17 @@
         <w:t>Cities may only be chosen from a finite list of cities where service is available, which is selected from a dropdown list. The user may not define options outside of those provided.</w:t>
       </w:r>
     </w:p>
-    <w:p/>
+    <w:p>
+      <w:pPr>
+        <w:pStyle w:val="ListParagraph"/>
+        <w:ind w:left="1440"/>
+      </w:pPr>
+    </w:p>
+    <w:p>
+      <w:r>
+        <w:br w:type="page"/>
+      </w:r>
+    </w:p>
     <w:p>
       <w:pPr>
         <w:pStyle w:val="ListParagraph"/>
@@ -395,30 +428,57 @@
         </w:numPr>
       </w:pPr>
       <w:r>
-        <w:t>Contact us screen:</w:t>
+        <w:lastRenderedPageBreak/>
+        <w:t>Daily schedule i</w:t>
       </w:r>
-    </w:p>
-    <w:p/>
-    <w:p>
-      <w:pPr>
-        <w:pStyle w:val="ListParagraph"/>
-        <w:numPr>
-          <w:ilvl w:val="0"/>
-          <w:numId w:val="1"/>
-        </w:numPr>
-      </w:pPr>
       <w:r>
-        <w:t>Informational screen:</w:t>
+        <w:t>nformation screen:</w:t>
       </w:r>
     </w:p>
     <w:p>
       <w:pPr>
         <w:pStyle w:val="ListParagraph"/>
       </w:pPr>
+      <w:r>
+        <w:drawing>
+          <wp:inline distT="0" distB="0" distL="0" distR="0" wp14:anchorId="6F7044A5" wp14:editId="48C78035">
+            <wp:extent cx="5943600" cy="3828415"/>
+            <wp:effectExtent l="0" t="0" r="0" b="635"/>
+            <wp:docPr id="2067899024" name="Picture 1" descr="A screenshot of a computer&#10;&#10;AI-generated content may be incorrect."/>
+            <wp:cNvGraphicFramePr>
+              <a:graphicFrameLocks xmlns:a="http://schemas.openxmlformats.org/drawingml/2006/main" noChangeAspect="1"/>
+            </wp:cNvGraphicFramePr>
+            <a:graphic xmlns:a="http://schemas.openxmlformats.org/drawingml/2006/main">
+              <a:graphicData uri="http://schemas.openxmlformats.org/drawingml/2006/picture">
+                <pic:pic xmlns:pic="http://schemas.openxmlformats.org/drawingml/2006/picture">
+                  <pic:nvPicPr>
+                    <pic:cNvPr id="2067899024" name="Picture 1" descr="A screenshot of a computer&#10;&#10;AI-generated content may be incorrect."/>
+                    <pic:cNvPicPr/>
+                  </pic:nvPicPr>
+                  <pic:blipFill>
+                    <a:blip r:embed="rId16"/>
+                    <a:stretch>
+                      <a:fillRect/>
+                    </a:stretch>
+                  </pic:blipFill>
+                  <pic:spPr>
+                    <a:xfrm>
+                      <a:off x="0" y="0"/>
+                      <a:ext cx="5943600" cy="3828415"/>
+                    </a:xfrm>
+                    <a:prstGeom prst="rect">
+                      <a:avLst/>
+                    </a:prstGeom>
+                  </pic:spPr>
+                </pic:pic>
+              </a:graphicData>
+            </a:graphic>
+          </wp:inline>
+        </w:drawing>
+      </w:r>
     </w:p>
     <w:p>
       <w:r>
-        <w:lastRenderedPageBreak/>
         <w:t xml:space="preserve">Note that </w:t>
       </w:r>
       <w:r>
@@ -446,6 +506,11 @@
           <w:bCs/>
         </w:rPr>
         <w:t>Mobile Platform? Responsive web design?</w:t>
+      </w:r>
+    </w:p>
+    <w:p>
+      <w:r>
+        <w:t>The questionnaire results show that users prefer the option to access SIM via their mobile devices. While it is possible to use non-responsive web design and target mobile devices alone, this solution would not account for the varying screen dimensions among mobile devices, the choice of portrait or landscape layout, or the optional use of desktop/laptop access. Therefore, responsive web design should be used.</w:t>
       </w:r>
     </w:p>
     <w:p/>
@@ -625,6 +690,7 @@
           <w:b/>
           <w:bCs/>
         </w:rPr>
+        <w:lastRenderedPageBreak/>
         <w:t xml:space="preserve">Maddox’s parts </w:t>
       </w:r>
       <w:r>

</xml_diff>

<commit_message>
- Wrote Python class to generate a report for a part
</commit_message>
<xml_diff>
--- a/aw_chapter_7_template.docx
+++ b/aw_chapter_7_template.docx
@@ -112,35 +112,7 @@
           <w:b/>
           <w:bCs/>
         </w:rPr>
-        <w:t>Mockups</w:t>
-      </w:r>
-      <w:r>
-        <w:rPr>
-          <w:b/>
-          <w:bCs/>
-        </w:rPr>
-        <w:t xml:space="preserve"> (</w:t>
-      </w:r>
-      <w:r>
-        <w:rPr>
-          <w:b/>
-          <w:bCs/>
-        </w:rPr>
-        <w:t>create</w:t>
-      </w:r>
-      <w:r>
-        <w:rPr>
-          <w:b/>
-          <w:bCs/>
-        </w:rPr>
-        <w:t xml:space="preserve"> at least 2 mockup screens)</w:t>
-      </w:r>
-      <w:r>
-        <w:rPr>
-          <w:b/>
-          <w:bCs/>
-        </w:rPr>
-        <w:t>:</w:t>
+        <w:t>Mockups:</w:t>
       </w:r>
     </w:p>
     <w:p>
@@ -368,15 +340,7 @@
         </w:numPr>
       </w:pPr>
       <w:r>
-        <w:t xml:space="preserve">Email address must be in the form </w:t>
-      </w:r>
-      <w:proofErr w:type="spellStart"/>
-      <w:r>
-        <w:t>username@domain</w:t>
-      </w:r>
-      <w:proofErr w:type="spellEnd"/>
-      <w:r>
-        <w:t>, where domain must have a top-level domain extension, such as .com.</w:t>
+        <w:t>Email address must be in the form username@domain, where domain must have a top-level domain extension, such as .com.</w:t>
       </w:r>
     </w:p>
     <w:p>
@@ -387,13 +351,8 @@
           <w:numId w:val="1"/>
         </w:numPr>
       </w:pPr>
-      <w:proofErr w:type="gramStart"/>
       <w:r>
-        <w:t>State</w:t>
-      </w:r>
-      <w:proofErr w:type="gramEnd"/>
-      <w:r>
-        <w:t xml:space="preserve"> may only be chosen from a finite list of states where service is available, which is selected from a dropdown list. The user may not define options outside of those provided.</w:t>
+        <w:t>State may only be chosen from a finite list of states where service is available, which is selected from a dropdown list. The user may not define options outside of those provided.</w:t>
       </w:r>
     </w:p>
     <w:p>
@@ -568,7 +527,34 @@
               </w:numPr>
             </w:pPr>
             <w:r>
+              <w:t>Results in a system tailored to the users’ needs</w:t>
+            </w:r>
+          </w:p>
+          <w:p>
+            <w:pPr>
+              <w:pStyle w:val="ListParagraph"/>
+              <w:numPr>
+                <w:ilvl w:val="0"/>
+                <w:numId w:val="4"/>
+              </w:numPr>
+            </w:pPr>
+            <w:r>
+              <w:t>Lightens the burden of communicating requirements effectively</w:t>
+            </w:r>
+            <w:r>
               <w:t xml:space="preserve"> </w:t>
+            </w:r>
+          </w:p>
+          <w:p>
+            <w:pPr>
+              <w:pStyle w:val="ListParagraph"/>
+              <w:numPr>
+                <w:ilvl w:val="0"/>
+                <w:numId w:val="4"/>
+              </w:numPr>
+            </w:pPr>
+            <w:r>
+              <w:t>Small company size allows prototypes to be assessed by all employees</w:t>
             </w:r>
           </w:p>
           <w:p>
@@ -611,6 +597,25 @@
                 <w:bCs/>
               </w:rPr>
             </w:pPr>
+            <w:r>
+              <w:t>Longer development time</w:t>
+            </w:r>
+          </w:p>
+          <w:p>
+            <w:pPr>
+              <w:pStyle w:val="ListParagraph"/>
+              <w:numPr>
+                <w:ilvl w:val="0"/>
+                <w:numId w:val="4"/>
+              </w:numPr>
+              <w:rPr>
+                <w:b/>
+                <w:bCs/>
+              </w:rPr>
+            </w:pPr>
+            <w:r>
+              <w:t>Redundant development</w:t>
+            </w:r>
           </w:p>
         </w:tc>
       </w:tr>
@@ -627,6 +632,7 @@
           <w:b/>
           <w:bCs/>
         </w:rPr>
+        <w:lastRenderedPageBreak/>
         <w:t>Report Mockups:</w:t>
       </w:r>
     </w:p>
@@ -690,7 +696,6 @@
           <w:b/>
           <w:bCs/>
         </w:rPr>
-        <w:lastRenderedPageBreak/>
         <w:t xml:space="preserve">Maddox’s parts </w:t>
       </w:r>
       <w:r>
@@ -2710,10 +2715,24 @@
     <dgm:pt modelId="{CA82D83E-C97E-4FDE-BEA2-01C1AEC385A8}" type="parTrans" cxnId="{BC287D72-CDF3-4457-A96E-EA5A0C6A0C1C}">
       <dgm:prSet/>
       <dgm:spPr/>
+      <dgm:t>
+        <a:bodyPr/>
+        <a:lstStyle/>
+        <a:p>
+          <a:endParaRPr lang="en-US"/>
+        </a:p>
+      </dgm:t>
     </dgm:pt>
     <dgm:pt modelId="{9C471EA0-A3C8-4653-9F73-D8EBBB33430F}" type="sibTrans" cxnId="{BC287D72-CDF3-4457-A96E-EA5A0C6A0C1C}">
       <dgm:prSet/>
       <dgm:spPr/>
+      <dgm:t>
+        <a:bodyPr/>
+        <a:lstStyle/>
+        <a:p>
+          <a:endParaRPr lang="en-US"/>
+        </a:p>
+      </dgm:t>
     </dgm:pt>
     <dgm:pt modelId="{1858BE31-4D46-4F9C-BB43-088A58D13616}">
       <dgm:prSet phldrT="[Text]"/>
@@ -2732,10 +2751,24 @@
     <dgm:pt modelId="{31EB31ED-50FB-4C5E-A3C3-6BA5F73DBBD1}" type="parTrans" cxnId="{4BEE046B-86D2-456E-8FEA-21362667347E}">
       <dgm:prSet/>
       <dgm:spPr/>
+      <dgm:t>
+        <a:bodyPr/>
+        <a:lstStyle/>
+        <a:p>
+          <a:endParaRPr lang="en-US"/>
+        </a:p>
+      </dgm:t>
     </dgm:pt>
     <dgm:pt modelId="{0867B240-69E1-4520-B911-DE5147DE718E}" type="sibTrans" cxnId="{4BEE046B-86D2-456E-8FEA-21362667347E}">
       <dgm:prSet/>
       <dgm:spPr/>
+      <dgm:t>
+        <a:bodyPr/>
+        <a:lstStyle/>
+        <a:p>
+          <a:endParaRPr lang="en-US"/>
+        </a:p>
+      </dgm:t>
     </dgm:pt>
     <dgm:pt modelId="{8CC8D37F-76A6-4676-9972-11B1C21C19C0}">
       <dgm:prSet phldrT="[Text]"/>
@@ -2754,10 +2787,24 @@
     <dgm:pt modelId="{326D18E5-A46D-450B-AE23-F5BFF70A2323}" type="parTrans" cxnId="{427339F7-D394-47C7-945E-4D5EB0341D85}">
       <dgm:prSet/>
       <dgm:spPr/>
+      <dgm:t>
+        <a:bodyPr/>
+        <a:lstStyle/>
+        <a:p>
+          <a:endParaRPr lang="en-US"/>
+        </a:p>
+      </dgm:t>
     </dgm:pt>
     <dgm:pt modelId="{CC0D9032-4F13-4B13-B6B3-78D7B23ECBDC}" type="sibTrans" cxnId="{427339F7-D394-47C7-945E-4D5EB0341D85}">
       <dgm:prSet/>
       <dgm:spPr/>
+      <dgm:t>
+        <a:bodyPr/>
+        <a:lstStyle/>
+        <a:p>
+          <a:endParaRPr lang="en-US"/>
+        </a:p>
+      </dgm:t>
     </dgm:pt>
     <dgm:pt modelId="{A09B4029-7FAA-466E-A964-6EEA8F473E37}" type="pres">
       <dgm:prSet presAssocID="{DF454900-CF85-4516-8F3E-6E6FDC52EB04}" presName="hierChild1" presStyleCnt="0">

</xml_diff>

<commit_message>
Generated exception and detail reports
</commit_message>
<xml_diff>
--- a/aw_chapter_7_template.docx
+++ b/aw_chapter_7_template.docx
@@ -486,6 +486,11 @@
           <w:bCs/>
         </w:rPr>
         <w:t xml:space="preserve">Prototyping? </w:t>
+      </w:r>
+    </w:p>
+    <w:p>
+      <w:r>
+        <w:t>We believe that prototyping should be used, as the following advantages outweigh the disadvantages:</w:t>
       </w:r>
     </w:p>
     <w:tbl>
@@ -554,6 +559,7 @@
               </w:numPr>
             </w:pPr>
             <w:r>
+              <w:lastRenderedPageBreak/>
               <w:t>Small company size allows prototypes to be assessed by all employees</w:t>
             </w:r>
           </w:p>
@@ -582,6 +588,7 @@
                 <w:b/>
                 <w:bCs/>
               </w:rPr>
+              <w:lastRenderedPageBreak/>
               <w:t>Disadvantages:</w:t>
             </w:r>
           </w:p>
@@ -616,6 +623,9 @@
             <w:r>
               <w:t>Redundant development</w:t>
             </w:r>
+            <w:r>
+              <w:t>, as the working information system may rewrite code that was already written during prototyping</w:t>
+            </w:r>
           </w:p>
         </w:tc>
       </w:tr>
@@ -632,7 +642,6 @@
           <w:b/>
           <w:bCs/>
         </w:rPr>
-        <w:lastRenderedPageBreak/>
         <w:t>Report Mockups:</w:t>
       </w:r>
     </w:p>
@@ -716,7 +725,1661 @@
     </w:p>
     <w:p>
       <w:pPr>
-        <w:pStyle w:val="ListParagraph"/>
+        <w:pStyle w:val="PlainText"/>
+        <w:rPr>
+          <w:rFonts w:ascii="Courier New" w:hAnsi="Courier New" w:cs="Courier New"/>
+        </w:rPr>
+      </w:pPr>
+      <w:r>
+        <w:rPr>
+          <w:rFonts w:ascii="Courier New" w:hAnsi="Courier New" w:cs="Courier New"/>
+        </w:rPr>
+        <w:t>--- DETAIL REPORT ---</w:t>
+      </w:r>
+    </w:p>
+    <w:p>
+      <w:pPr>
+        <w:pStyle w:val="PlainText"/>
+        <w:rPr>
+          <w:rFonts w:ascii="Courier New" w:hAnsi="Courier New" w:cs="Courier New"/>
+        </w:rPr>
+      </w:pPr>
+      <w:r>
+        <w:rPr>
+          <w:rFonts w:ascii="Courier New" w:hAnsi="Courier New" w:cs="Courier New"/>
+        </w:rPr>
+        <w:t>ITEM WDX50934</w:t>
+      </w:r>
+    </w:p>
+    <w:p>
+      <w:pPr>
+        <w:pStyle w:val="PlainText"/>
+        <w:rPr>
+          <w:rFonts w:ascii="Courier New" w:hAnsi="Courier New" w:cs="Courier New"/>
+        </w:rPr>
+      </w:pPr>
+      <w:r>
+        <w:rPr>
+          <w:rFonts w:ascii="Courier New" w:hAnsi="Courier New" w:cs="Courier New"/>
+        </w:rPr>
+        <w:tab/>
+        <w:t>-QUANTITY IN STOCK--</w:t>
+      </w:r>
+      <w:r>
+        <w:rPr>
+          <w:rFonts w:ascii="Courier New" w:hAnsi="Courier New" w:cs="Courier New"/>
+        </w:rPr>
+        <w:tab/>
+        <w:t>-QUANTITY REQUESTED-</w:t>
+      </w:r>
+      <w:r>
+        <w:rPr>
+          <w:rFonts w:ascii="Courier New" w:hAnsi="Courier New" w:cs="Courier New"/>
+        </w:rPr>
+        <w:tab/>
+      </w:r>
+    </w:p>
+    <w:p>
+      <w:pPr>
+        <w:pStyle w:val="PlainText"/>
+        <w:rPr>
+          <w:rFonts w:ascii="Courier New" w:hAnsi="Courier New" w:cs="Courier New"/>
+        </w:rPr>
+      </w:pPr>
+      <w:r>
+        <w:rPr>
+          <w:rFonts w:ascii="Courier New" w:hAnsi="Courier New" w:cs="Courier New"/>
+        </w:rPr>
+        <w:tab/>
+        <w:t xml:space="preserve">        374         </w:t>
+      </w:r>
+      <w:r>
+        <w:rPr>
+          <w:rFonts w:ascii="Courier New" w:hAnsi="Courier New" w:cs="Courier New"/>
+        </w:rPr>
+        <w:tab/>
+        <w:t xml:space="preserve">         29         </w:t>
+      </w:r>
+      <w:r>
+        <w:rPr>
+          <w:rFonts w:ascii="Courier New" w:hAnsi="Courier New" w:cs="Courier New"/>
+        </w:rPr>
+        <w:tab/>
+      </w:r>
+    </w:p>
+    <w:p>
+      <w:pPr>
+        <w:pStyle w:val="PlainText"/>
+        <w:rPr>
+          <w:rFonts w:ascii="Courier New" w:hAnsi="Courier New" w:cs="Courier New"/>
+        </w:rPr>
+      </w:pPr>
+    </w:p>
+    <w:p>
+      <w:pPr>
+        <w:pStyle w:val="PlainText"/>
+        <w:rPr>
+          <w:rFonts w:ascii="Courier New" w:hAnsi="Courier New" w:cs="Courier New"/>
+        </w:rPr>
+      </w:pPr>
+      <w:r>
+        <w:rPr>
+          <w:rFonts w:ascii="Courier New" w:hAnsi="Courier New" w:cs="Courier New"/>
+        </w:rPr>
+        <w:tab/>
+        <w:t>-----UNIT PRICE-----</w:t>
+      </w:r>
+      <w:r>
+        <w:rPr>
+          <w:rFonts w:ascii="Courier New" w:hAnsi="Courier New" w:cs="Courier New"/>
+        </w:rPr>
+        <w:tab/>
+        <w:t>-------VENDOR-------</w:t>
+      </w:r>
+      <w:r>
+        <w:rPr>
+          <w:rFonts w:ascii="Courier New" w:hAnsi="Courier New" w:cs="Courier New"/>
+        </w:rPr>
+        <w:tab/>
+      </w:r>
+    </w:p>
+    <w:p>
+      <w:pPr>
+        <w:pStyle w:val="PlainText"/>
+        <w:rPr>
+          <w:rFonts w:ascii="Courier New" w:hAnsi="Courier New" w:cs="Courier New"/>
+        </w:rPr>
+      </w:pPr>
+      <w:r>
+        <w:rPr>
+          <w:rFonts w:ascii="Courier New" w:hAnsi="Courier New" w:cs="Courier New"/>
+        </w:rPr>
+        <w:tab/>
+        <w:t xml:space="preserve">         29         </w:t>
+      </w:r>
+      <w:r>
+        <w:rPr>
+          <w:rFonts w:ascii="Courier New" w:hAnsi="Courier New" w:cs="Courier New"/>
+        </w:rPr>
+        <w:tab/>
+        <w:t xml:space="preserve">     Whirlpool      </w:t>
+      </w:r>
+      <w:r>
+        <w:rPr>
+          <w:rFonts w:ascii="Courier New" w:hAnsi="Courier New" w:cs="Courier New"/>
+        </w:rPr>
+        <w:tab/>
+      </w:r>
+    </w:p>
+    <w:p>
+      <w:pPr>
+        <w:pStyle w:val="PlainText"/>
+        <w:rPr>
+          <w:rFonts w:ascii="Courier New" w:hAnsi="Courier New" w:cs="Courier New"/>
+        </w:rPr>
+      </w:pPr>
+    </w:p>
+    <w:p>
+      <w:pPr>
+        <w:pStyle w:val="PlainText"/>
+        <w:rPr>
+          <w:rFonts w:ascii="Courier New" w:hAnsi="Courier New" w:cs="Courier New"/>
+        </w:rPr>
+      </w:pPr>
+      <w:r>
+        <w:rPr>
+          <w:rFonts w:ascii="Courier New" w:hAnsi="Courier New" w:cs="Courier New"/>
+        </w:rPr>
+        <w:tab/>
+        <w:t>--LAST INVENTORIED--</w:t>
+      </w:r>
+      <w:r>
+        <w:rPr>
+          <w:rFonts w:ascii="Courier New" w:hAnsi="Courier New" w:cs="Courier New"/>
+        </w:rPr>
+        <w:tab/>
+        <w:t>ORDER SIZE IN UNITS-</w:t>
+      </w:r>
+      <w:r>
+        <w:rPr>
+          <w:rFonts w:ascii="Courier New" w:hAnsi="Courier New" w:cs="Courier New"/>
+        </w:rPr>
+        <w:tab/>
+      </w:r>
+    </w:p>
+    <w:p>
+      <w:pPr>
+        <w:pStyle w:val="PlainText"/>
+        <w:rPr>
+          <w:rFonts w:ascii="Courier New" w:hAnsi="Courier New" w:cs="Courier New"/>
+        </w:rPr>
+      </w:pPr>
+      <w:r>
+        <w:rPr>
+          <w:rFonts w:ascii="Courier New" w:hAnsi="Courier New" w:cs="Courier New"/>
+        </w:rPr>
+        <w:tab/>
+        <w:t xml:space="preserve">  2025-10-17 08:43  </w:t>
+      </w:r>
+      <w:r>
+        <w:rPr>
+          <w:rFonts w:ascii="Courier New" w:hAnsi="Courier New" w:cs="Courier New"/>
+        </w:rPr>
+        <w:tab/>
+        <w:t xml:space="preserve">         16         </w:t>
+      </w:r>
+      <w:r>
+        <w:rPr>
+          <w:rFonts w:ascii="Courier New" w:hAnsi="Courier New" w:cs="Courier New"/>
+        </w:rPr>
+        <w:tab/>
+      </w:r>
+    </w:p>
+    <w:p>
+      <w:pPr>
+        <w:pStyle w:val="PlainText"/>
+        <w:rPr>
+          <w:rFonts w:ascii="Courier New" w:hAnsi="Courier New" w:cs="Courier New"/>
+        </w:rPr>
+      </w:pPr>
+    </w:p>
+    <w:p>
+      <w:pPr>
+        <w:pStyle w:val="PlainText"/>
+        <w:rPr>
+          <w:rFonts w:ascii="Courier New" w:hAnsi="Courier New" w:cs="Courier New"/>
+        </w:rPr>
+      </w:pPr>
+      <w:r>
+        <w:rPr>
+          <w:rFonts w:ascii="Courier New" w:hAnsi="Courier New" w:cs="Courier New"/>
+        </w:rPr>
+        <w:tab/>
+        <w:t>---QUANTITY SHORT---</w:t>
+      </w:r>
+      <w:r>
+        <w:rPr>
+          <w:rFonts w:ascii="Courier New" w:hAnsi="Courier New" w:cs="Courier New"/>
+        </w:rPr>
+        <w:tab/>
+        <w:t>-QUANTITY TO ORDER--</w:t>
+      </w:r>
+      <w:r>
+        <w:rPr>
+          <w:rFonts w:ascii="Courier New" w:hAnsi="Courier New" w:cs="Courier New"/>
+        </w:rPr>
+        <w:tab/>
+      </w:r>
+    </w:p>
+    <w:p>
+      <w:pPr>
+        <w:pStyle w:val="PlainText"/>
+        <w:rPr>
+          <w:rFonts w:ascii="Courier New" w:hAnsi="Courier New" w:cs="Courier New"/>
+        </w:rPr>
+      </w:pPr>
+      <w:r>
+        <w:rPr>
+          <w:rFonts w:ascii="Courier New" w:hAnsi="Courier New" w:cs="Courier New"/>
+        </w:rPr>
+        <w:tab/>
+        <w:t xml:space="preserve">         0          </w:t>
+      </w:r>
+      <w:r>
+        <w:rPr>
+          <w:rFonts w:ascii="Courier New" w:hAnsi="Courier New" w:cs="Courier New"/>
+        </w:rPr>
+        <w:tab/>
+        <w:t xml:space="preserve">         0          </w:t>
+      </w:r>
+      <w:r>
+        <w:rPr>
+          <w:rFonts w:ascii="Courier New" w:hAnsi="Courier New" w:cs="Courier New"/>
+        </w:rPr>
+        <w:tab/>
+      </w:r>
+    </w:p>
+    <w:p>
+      <w:pPr>
+        <w:pStyle w:val="PlainText"/>
+        <w:rPr>
+          <w:rFonts w:ascii="Courier New" w:hAnsi="Courier New" w:cs="Courier New"/>
+        </w:rPr>
+      </w:pPr>
+    </w:p>
+    <w:p>
+      <w:pPr>
+        <w:pStyle w:val="PlainText"/>
+        <w:rPr>
+          <w:rFonts w:ascii="Courier New" w:hAnsi="Courier New" w:cs="Courier New"/>
+        </w:rPr>
+      </w:pPr>
+      <w:r>
+        <w:rPr>
+          <w:rFonts w:ascii="Courier New" w:hAnsi="Courier New" w:cs="Courier New"/>
+        </w:rPr>
+        <w:tab/>
+        <w:t>--NEXT ORDER COST---</w:t>
+      </w:r>
+      <w:r>
+        <w:rPr>
+          <w:rFonts w:ascii="Courier New" w:hAnsi="Courier New" w:cs="Courier New"/>
+        </w:rPr>
+        <w:tab/>
+      </w:r>
+    </w:p>
+    <w:p>
+      <w:pPr>
+        <w:pStyle w:val="PlainText"/>
+        <w:rPr>
+          <w:rFonts w:ascii="Courier New" w:hAnsi="Courier New" w:cs="Courier New"/>
+        </w:rPr>
+      </w:pPr>
+      <w:r>
+        <w:rPr>
+          <w:rFonts w:ascii="Courier New" w:hAnsi="Courier New" w:cs="Courier New"/>
+        </w:rPr>
+        <w:tab/>
+        <w:t xml:space="preserve">         0          </w:t>
+      </w:r>
+      <w:r>
+        <w:rPr>
+          <w:rFonts w:ascii="Courier New" w:hAnsi="Courier New" w:cs="Courier New"/>
+        </w:rPr>
+        <w:tab/>
+      </w:r>
+    </w:p>
+    <w:p>
+      <w:pPr>
+        <w:pStyle w:val="PlainText"/>
+        <w:rPr>
+          <w:rFonts w:ascii="Courier New" w:hAnsi="Courier New" w:cs="Courier New"/>
+        </w:rPr>
+      </w:pPr>
+    </w:p>
+    <w:p>
+      <w:pPr>
+        <w:pStyle w:val="PlainText"/>
+        <w:rPr>
+          <w:rFonts w:ascii="Courier New" w:hAnsi="Courier New" w:cs="Courier New"/>
+        </w:rPr>
+      </w:pPr>
+    </w:p>
+    <w:p>
+      <w:pPr>
+        <w:pStyle w:val="PlainText"/>
+        <w:rPr>
+          <w:rFonts w:ascii="Courier New" w:hAnsi="Courier New" w:cs="Courier New"/>
+        </w:rPr>
+      </w:pPr>
+      <w:r>
+        <w:rPr>
+          <w:rFonts w:ascii="Courier New" w:hAnsi="Courier New" w:cs="Courier New"/>
+        </w:rPr>
+        <w:t>ITEM PRT-109D</w:t>
+      </w:r>
+    </w:p>
+    <w:p>
+      <w:pPr>
+        <w:pStyle w:val="PlainText"/>
+        <w:rPr>
+          <w:rFonts w:ascii="Courier New" w:hAnsi="Courier New" w:cs="Courier New"/>
+        </w:rPr>
+      </w:pPr>
+      <w:r>
+        <w:rPr>
+          <w:rFonts w:ascii="Courier New" w:hAnsi="Courier New" w:cs="Courier New"/>
+        </w:rPr>
+        <w:tab/>
+        <w:t>-QUANTITY IN STOCK--</w:t>
+      </w:r>
+      <w:r>
+        <w:rPr>
+          <w:rFonts w:ascii="Courier New" w:hAnsi="Courier New" w:cs="Courier New"/>
+        </w:rPr>
+        <w:tab/>
+        <w:t>-QUANTITY REQUESTED-</w:t>
+      </w:r>
+      <w:r>
+        <w:rPr>
+          <w:rFonts w:ascii="Courier New" w:hAnsi="Courier New" w:cs="Courier New"/>
+        </w:rPr>
+        <w:tab/>
+      </w:r>
+    </w:p>
+    <w:p>
+      <w:pPr>
+        <w:pStyle w:val="PlainText"/>
+        <w:rPr>
+          <w:rFonts w:ascii="Courier New" w:hAnsi="Courier New" w:cs="Courier New"/>
+        </w:rPr>
+      </w:pPr>
+      <w:r>
+        <w:rPr>
+          <w:rFonts w:ascii="Courier New" w:hAnsi="Courier New" w:cs="Courier New"/>
+        </w:rPr>
+        <w:tab/>
+        <w:t xml:space="preserve">         5          </w:t>
+      </w:r>
+      <w:r>
+        <w:rPr>
+          <w:rFonts w:ascii="Courier New" w:hAnsi="Courier New" w:cs="Courier New"/>
+        </w:rPr>
+        <w:tab/>
+        <w:t xml:space="preserve">         7          </w:t>
+      </w:r>
+      <w:r>
+        <w:rPr>
+          <w:rFonts w:ascii="Courier New" w:hAnsi="Courier New" w:cs="Courier New"/>
+        </w:rPr>
+        <w:tab/>
+      </w:r>
+    </w:p>
+    <w:p>
+      <w:pPr>
+        <w:pStyle w:val="PlainText"/>
+        <w:rPr>
+          <w:rFonts w:ascii="Courier New" w:hAnsi="Courier New" w:cs="Courier New"/>
+        </w:rPr>
+      </w:pPr>
+    </w:p>
+    <w:p>
+      <w:pPr>
+        <w:pStyle w:val="PlainText"/>
+        <w:rPr>
+          <w:rFonts w:ascii="Courier New" w:hAnsi="Courier New" w:cs="Courier New"/>
+        </w:rPr>
+      </w:pPr>
+      <w:r>
+        <w:rPr>
+          <w:rFonts w:ascii="Courier New" w:hAnsi="Courier New" w:cs="Courier New"/>
+        </w:rPr>
+        <w:tab/>
+        <w:t>-----UNIT PRICE-----</w:t>
+      </w:r>
+      <w:r>
+        <w:rPr>
+          <w:rFonts w:ascii="Courier New" w:hAnsi="Courier New" w:cs="Courier New"/>
+        </w:rPr>
+        <w:tab/>
+        <w:t>-------VENDOR-------</w:t>
+      </w:r>
+      <w:r>
+        <w:rPr>
+          <w:rFonts w:ascii="Courier New" w:hAnsi="Courier New" w:cs="Courier New"/>
+        </w:rPr>
+        <w:tab/>
+      </w:r>
+    </w:p>
+    <w:p>
+      <w:pPr>
+        <w:pStyle w:val="PlainText"/>
+        <w:rPr>
+          <w:rFonts w:ascii="Courier New" w:hAnsi="Courier New" w:cs="Courier New"/>
+        </w:rPr>
+      </w:pPr>
+      <w:r>
+        <w:rPr>
+          <w:rFonts w:ascii="Courier New" w:hAnsi="Courier New" w:cs="Courier New"/>
+        </w:rPr>
+        <w:tab/>
+        <w:t xml:space="preserve">         14         </w:t>
+      </w:r>
+      <w:r>
+        <w:rPr>
+          <w:rFonts w:ascii="Courier New" w:hAnsi="Courier New" w:cs="Courier New"/>
+        </w:rPr>
+        <w:tab/>
+        <w:t xml:space="preserve">         LG         </w:t>
+      </w:r>
+      <w:r>
+        <w:rPr>
+          <w:rFonts w:ascii="Courier New" w:hAnsi="Courier New" w:cs="Courier New"/>
+        </w:rPr>
+        <w:tab/>
+      </w:r>
+    </w:p>
+    <w:p>
+      <w:pPr>
+        <w:pStyle w:val="PlainText"/>
+        <w:rPr>
+          <w:rFonts w:ascii="Courier New" w:hAnsi="Courier New" w:cs="Courier New"/>
+        </w:rPr>
+      </w:pPr>
+    </w:p>
+    <w:p>
+      <w:pPr>
+        <w:pStyle w:val="PlainText"/>
+        <w:rPr>
+          <w:rFonts w:ascii="Courier New" w:hAnsi="Courier New" w:cs="Courier New"/>
+        </w:rPr>
+      </w:pPr>
+      <w:r>
+        <w:rPr>
+          <w:rFonts w:ascii="Courier New" w:hAnsi="Courier New" w:cs="Courier New"/>
+        </w:rPr>
+        <w:tab/>
+        <w:t>--LAST INVENTORIED--</w:t>
+      </w:r>
+      <w:r>
+        <w:rPr>
+          <w:rFonts w:ascii="Courier New" w:hAnsi="Courier New" w:cs="Courier New"/>
+        </w:rPr>
+        <w:tab/>
+        <w:t>ORDER SIZE IN UNITS-</w:t>
+      </w:r>
+      <w:r>
+        <w:rPr>
+          <w:rFonts w:ascii="Courier New" w:hAnsi="Courier New" w:cs="Courier New"/>
+        </w:rPr>
+        <w:tab/>
+      </w:r>
+    </w:p>
+    <w:p>
+      <w:pPr>
+        <w:pStyle w:val="PlainText"/>
+        <w:rPr>
+          <w:rFonts w:ascii="Courier New" w:hAnsi="Courier New" w:cs="Courier New"/>
+        </w:rPr>
+      </w:pPr>
+      <w:r>
+        <w:rPr>
+          <w:rFonts w:ascii="Courier New" w:hAnsi="Courier New" w:cs="Courier New"/>
+        </w:rPr>
+        <w:tab/>
+        <w:t xml:space="preserve">  2025-10-15 08:18  </w:t>
+      </w:r>
+      <w:r>
+        <w:rPr>
+          <w:rFonts w:ascii="Courier New" w:hAnsi="Courier New" w:cs="Courier New"/>
+        </w:rPr>
+        <w:tab/>
+        <w:t xml:space="preserve">         30         </w:t>
+      </w:r>
+      <w:r>
+        <w:rPr>
+          <w:rFonts w:ascii="Courier New" w:hAnsi="Courier New" w:cs="Courier New"/>
+        </w:rPr>
+        <w:tab/>
+      </w:r>
+    </w:p>
+    <w:p>
+      <w:pPr>
+        <w:pStyle w:val="PlainText"/>
+        <w:rPr>
+          <w:rFonts w:ascii="Courier New" w:hAnsi="Courier New" w:cs="Courier New"/>
+        </w:rPr>
+      </w:pPr>
+    </w:p>
+    <w:p>
+      <w:pPr>
+        <w:pStyle w:val="PlainText"/>
+        <w:rPr>
+          <w:rFonts w:ascii="Courier New" w:hAnsi="Courier New" w:cs="Courier New"/>
+        </w:rPr>
+      </w:pPr>
+      <w:r>
+        <w:rPr>
+          <w:rFonts w:ascii="Courier New" w:hAnsi="Courier New" w:cs="Courier New"/>
+        </w:rPr>
+        <w:tab/>
+        <w:t>---QUANTITY SHORT---</w:t>
+      </w:r>
+      <w:r>
+        <w:rPr>
+          <w:rFonts w:ascii="Courier New" w:hAnsi="Courier New" w:cs="Courier New"/>
+        </w:rPr>
+        <w:tab/>
+        <w:t>-QUANTITY TO ORDER--</w:t>
+      </w:r>
+      <w:r>
+        <w:rPr>
+          <w:rFonts w:ascii="Courier New" w:hAnsi="Courier New" w:cs="Courier New"/>
+        </w:rPr>
+        <w:tab/>
+      </w:r>
+    </w:p>
+    <w:p>
+      <w:pPr>
+        <w:pStyle w:val="PlainText"/>
+        <w:rPr>
+          <w:rFonts w:ascii="Courier New" w:hAnsi="Courier New" w:cs="Courier New"/>
+        </w:rPr>
+      </w:pPr>
+      <w:r>
+        <w:rPr>
+          <w:rFonts w:ascii="Courier New" w:hAnsi="Courier New" w:cs="Courier New"/>
+        </w:rPr>
+        <w:tab/>
+        <w:t xml:space="preserve">         2          </w:t>
+      </w:r>
+      <w:r>
+        <w:rPr>
+          <w:rFonts w:ascii="Courier New" w:hAnsi="Courier New" w:cs="Courier New"/>
+        </w:rPr>
+        <w:tab/>
+        <w:t xml:space="preserve">         30         </w:t>
+      </w:r>
+      <w:r>
+        <w:rPr>
+          <w:rFonts w:ascii="Courier New" w:hAnsi="Courier New" w:cs="Courier New"/>
+        </w:rPr>
+        <w:tab/>
+      </w:r>
+    </w:p>
+    <w:p>
+      <w:pPr>
+        <w:pStyle w:val="PlainText"/>
+        <w:rPr>
+          <w:rFonts w:ascii="Courier New" w:hAnsi="Courier New" w:cs="Courier New"/>
+        </w:rPr>
+      </w:pPr>
+    </w:p>
+    <w:p>
+      <w:pPr>
+        <w:pStyle w:val="PlainText"/>
+        <w:rPr>
+          <w:rFonts w:ascii="Courier New" w:hAnsi="Courier New" w:cs="Courier New"/>
+        </w:rPr>
+      </w:pPr>
+      <w:r>
+        <w:rPr>
+          <w:rFonts w:ascii="Courier New" w:hAnsi="Courier New" w:cs="Courier New"/>
+        </w:rPr>
+        <w:tab/>
+        <w:t>--NEXT ORDER COST---</w:t>
+      </w:r>
+      <w:r>
+        <w:rPr>
+          <w:rFonts w:ascii="Courier New" w:hAnsi="Courier New" w:cs="Courier New"/>
+        </w:rPr>
+        <w:tab/>
+      </w:r>
+    </w:p>
+    <w:p>
+      <w:pPr>
+        <w:pStyle w:val="PlainText"/>
+        <w:rPr>
+          <w:rFonts w:ascii="Courier New" w:hAnsi="Courier New" w:cs="Courier New"/>
+        </w:rPr>
+      </w:pPr>
+      <w:r>
+        <w:rPr>
+          <w:rFonts w:ascii="Courier New" w:hAnsi="Courier New" w:cs="Courier New"/>
+        </w:rPr>
+        <w:tab/>
+        <w:t xml:space="preserve">        420         </w:t>
+      </w:r>
+      <w:r>
+        <w:rPr>
+          <w:rFonts w:ascii="Courier New" w:hAnsi="Courier New" w:cs="Courier New"/>
+        </w:rPr>
+        <w:tab/>
+      </w:r>
+    </w:p>
+    <w:p>
+      <w:pPr>
+        <w:pStyle w:val="PlainText"/>
+        <w:rPr>
+          <w:rFonts w:ascii="Courier New" w:hAnsi="Courier New" w:cs="Courier New"/>
+        </w:rPr>
+      </w:pPr>
+    </w:p>
+    <w:p>
+      <w:pPr>
+        <w:pStyle w:val="PlainText"/>
+        <w:rPr>
+          <w:rFonts w:ascii="Courier New" w:hAnsi="Courier New" w:cs="Courier New"/>
+        </w:rPr>
+      </w:pPr>
+    </w:p>
+    <w:p>
+      <w:pPr>
+        <w:pStyle w:val="PlainText"/>
+        <w:rPr>
+          <w:rFonts w:ascii="Courier New" w:hAnsi="Courier New" w:cs="Courier New"/>
+        </w:rPr>
+      </w:pPr>
+      <w:r>
+        <w:rPr>
+          <w:rFonts w:ascii="Courier New" w:hAnsi="Courier New" w:cs="Courier New"/>
+        </w:rPr>
+        <w:t>ITEM BQ-5543</w:t>
+      </w:r>
+    </w:p>
+    <w:p>
+      <w:pPr>
+        <w:pStyle w:val="PlainText"/>
+        <w:rPr>
+          <w:rFonts w:ascii="Courier New" w:hAnsi="Courier New" w:cs="Courier New"/>
+        </w:rPr>
+      </w:pPr>
+      <w:r>
+        <w:rPr>
+          <w:rFonts w:ascii="Courier New" w:hAnsi="Courier New" w:cs="Courier New"/>
+        </w:rPr>
+        <w:tab/>
+        <w:t>-QUANTITY IN STOCK--</w:t>
+      </w:r>
+      <w:r>
+        <w:rPr>
+          <w:rFonts w:ascii="Courier New" w:hAnsi="Courier New" w:cs="Courier New"/>
+        </w:rPr>
+        <w:tab/>
+        <w:t>-QUANTITY REQUESTED-</w:t>
+      </w:r>
+      <w:r>
+        <w:rPr>
+          <w:rFonts w:ascii="Courier New" w:hAnsi="Courier New" w:cs="Courier New"/>
+        </w:rPr>
+        <w:tab/>
+      </w:r>
+    </w:p>
+    <w:p>
+      <w:pPr>
+        <w:pStyle w:val="PlainText"/>
+        <w:rPr>
+          <w:rFonts w:ascii="Courier New" w:hAnsi="Courier New" w:cs="Courier New"/>
+        </w:rPr>
+      </w:pPr>
+      <w:r>
+        <w:rPr>
+          <w:rFonts w:ascii="Courier New" w:hAnsi="Courier New" w:cs="Courier New"/>
+        </w:rPr>
+        <w:tab/>
+        <w:t xml:space="preserve">         1          </w:t>
+      </w:r>
+      <w:r>
+        <w:rPr>
+          <w:rFonts w:ascii="Courier New" w:hAnsi="Courier New" w:cs="Courier New"/>
+        </w:rPr>
+        <w:tab/>
+        <w:t xml:space="preserve">         2          </w:t>
+      </w:r>
+      <w:r>
+        <w:rPr>
+          <w:rFonts w:ascii="Courier New" w:hAnsi="Courier New" w:cs="Courier New"/>
+        </w:rPr>
+        <w:tab/>
+      </w:r>
+    </w:p>
+    <w:p>
+      <w:pPr>
+        <w:pStyle w:val="PlainText"/>
+        <w:rPr>
+          <w:rFonts w:ascii="Courier New" w:hAnsi="Courier New" w:cs="Courier New"/>
+        </w:rPr>
+      </w:pPr>
+    </w:p>
+    <w:p>
+      <w:pPr>
+        <w:pStyle w:val="PlainText"/>
+        <w:rPr>
+          <w:rFonts w:ascii="Courier New" w:hAnsi="Courier New" w:cs="Courier New"/>
+        </w:rPr>
+      </w:pPr>
+      <w:r>
+        <w:rPr>
+          <w:rFonts w:ascii="Courier New" w:hAnsi="Courier New" w:cs="Courier New"/>
+        </w:rPr>
+        <w:tab/>
+        <w:t>-----UNIT PRICE-----</w:t>
+      </w:r>
+      <w:r>
+        <w:rPr>
+          <w:rFonts w:ascii="Courier New" w:hAnsi="Courier New" w:cs="Courier New"/>
+        </w:rPr>
+        <w:tab/>
+        <w:t>-------VENDOR-------</w:t>
+      </w:r>
+      <w:r>
+        <w:rPr>
+          <w:rFonts w:ascii="Courier New" w:hAnsi="Courier New" w:cs="Courier New"/>
+        </w:rPr>
+        <w:tab/>
+      </w:r>
+    </w:p>
+    <w:p>
+      <w:pPr>
+        <w:pStyle w:val="PlainText"/>
+        <w:rPr>
+          <w:rFonts w:ascii="Courier New" w:hAnsi="Courier New" w:cs="Courier New"/>
+        </w:rPr>
+      </w:pPr>
+      <w:r>
+        <w:rPr>
+          <w:rFonts w:ascii="Courier New" w:hAnsi="Courier New" w:cs="Courier New"/>
+        </w:rPr>
+        <w:tab/>
+        <w:t xml:space="preserve">         85         </w:t>
+      </w:r>
+      <w:r>
+        <w:rPr>
+          <w:rFonts w:ascii="Courier New" w:hAnsi="Courier New" w:cs="Courier New"/>
+        </w:rPr>
+        <w:tab/>
+        <w:t xml:space="preserve">       Bosch        </w:t>
+      </w:r>
+      <w:r>
+        <w:rPr>
+          <w:rFonts w:ascii="Courier New" w:hAnsi="Courier New" w:cs="Courier New"/>
+        </w:rPr>
+        <w:tab/>
+      </w:r>
+    </w:p>
+    <w:p>
+      <w:pPr>
+        <w:pStyle w:val="PlainText"/>
+        <w:rPr>
+          <w:rFonts w:ascii="Courier New" w:hAnsi="Courier New" w:cs="Courier New"/>
+        </w:rPr>
+      </w:pPr>
+    </w:p>
+    <w:p>
+      <w:pPr>
+        <w:pStyle w:val="PlainText"/>
+        <w:rPr>
+          <w:rFonts w:ascii="Courier New" w:hAnsi="Courier New" w:cs="Courier New"/>
+        </w:rPr>
+      </w:pPr>
+      <w:r>
+        <w:rPr>
+          <w:rFonts w:ascii="Courier New" w:hAnsi="Courier New" w:cs="Courier New"/>
+        </w:rPr>
+        <w:tab/>
+        <w:t>--LAST INVENTORIED--</w:t>
+      </w:r>
+      <w:r>
+        <w:rPr>
+          <w:rFonts w:ascii="Courier New" w:hAnsi="Courier New" w:cs="Courier New"/>
+        </w:rPr>
+        <w:tab/>
+        <w:t>ORDER SIZE IN UNITS-</w:t>
+      </w:r>
+      <w:r>
+        <w:rPr>
+          <w:rFonts w:ascii="Courier New" w:hAnsi="Courier New" w:cs="Courier New"/>
+        </w:rPr>
+        <w:tab/>
+      </w:r>
+    </w:p>
+    <w:p>
+      <w:pPr>
+        <w:pStyle w:val="PlainText"/>
+        <w:rPr>
+          <w:rFonts w:ascii="Courier New" w:hAnsi="Courier New" w:cs="Courier New"/>
+        </w:rPr>
+      </w:pPr>
+      <w:r>
+        <w:rPr>
+          <w:rFonts w:ascii="Courier New" w:hAnsi="Courier New" w:cs="Courier New"/>
+        </w:rPr>
+        <w:lastRenderedPageBreak/>
+        <w:tab/>
+        <w:t xml:space="preserve">  2025-10-17 19:53  </w:t>
+      </w:r>
+      <w:r>
+        <w:rPr>
+          <w:rFonts w:ascii="Courier New" w:hAnsi="Courier New" w:cs="Courier New"/>
+        </w:rPr>
+        <w:tab/>
+        <w:t xml:space="preserve">         5          </w:t>
+      </w:r>
+      <w:r>
+        <w:rPr>
+          <w:rFonts w:ascii="Courier New" w:hAnsi="Courier New" w:cs="Courier New"/>
+        </w:rPr>
+        <w:tab/>
+      </w:r>
+    </w:p>
+    <w:p>
+      <w:pPr>
+        <w:pStyle w:val="PlainText"/>
+        <w:rPr>
+          <w:rFonts w:ascii="Courier New" w:hAnsi="Courier New" w:cs="Courier New"/>
+        </w:rPr>
+      </w:pPr>
+    </w:p>
+    <w:p>
+      <w:pPr>
+        <w:pStyle w:val="PlainText"/>
+        <w:rPr>
+          <w:rFonts w:ascii="Courier New" w:hAnsi="Courier New" w:cs="Courier New"/>
+        </w:rPr>
+      </w:pPr>
+      <w:r>
+        <w:rPr>
+          <w:rFonts w:ascii="Courier New" w:hAnsi="Courier New" w:cs="Courier New"/>
+        </w:rPr>
+        <w:tab/>
+        <w:t>---QUANTITY SHORT---</w:t>
+      </w:r>
+      <w:r>
+        <w:rPr>
+          <w:rFonts w:ascii="Courier New" w:hAnsi="Courier New" w:cs="Courier New"/>
+        </w:rPr>
+        <w:tab/>
+        <w:t>-QUANTITY TO ORDER--</w:t>
+      </w:r>
+      <w:r>
+        <w:rPr>
+          <w:rFonts w:ascii="Courier New" w:hAnsi="Courier New" w:cs="Courier New"/>
+        </w:rPr>
+        <w:tab/>
+      </w:r>
+    </w:p>
+    <w:p>
+      <w:pPr>
+        <w:pStyle w:val="PlainText"/>
+        <w:rPr>
+          <w:rFonts w:ascii="Courier New" w:hAnsi="Courier New" w:cs="Courier New"/>
+        </w:rPr>
+      </w:pPr>
+      <w:r>
+        <w:rPr>
+          <w:rFonts w:ascii="Courier New" w:hAnsi="Courier New" w:cs="Courier New"/>
+        </w:rPr>
+        <w:tab/>
+        <w:t xml:space="preserve">         1          </w:t>
+      </w:r>
+      <w:r>
+        <w:rPr>
+          <w:rFonts w:ascii="Courier New" w:hAnsi="Courier New" w:cs="Courier New"/>
+        </w:rPr>
+        <w:tab/>
+        <w:t xml:space="preserve">         5          </w:t>
+      </w:r>
+      <w:r>
+        <w:rPr>
+          <w:rFonts w:ascii="Courier New" w:hAnsi="Courier New" w:cs="Courier New"/>
+        </w:rPr>
+        <w:tab/>
+      </w:r>
+    </w:p>
+    <w:p>
+      <w:pPr>
+        <w:pStyle w:val="PlainText"/>
+        <w:rPr>
+          <w:rFonts w:ascii="Courier New" w:hAnsi="Courier New" w:cs="Courier New"/>
+        </w:rPr>
+      </w:pPr>
+    </w:p>
+    <w:p>
+      <w:pPr>
+        <w:pStyle w:val="PlainText"/>
+        <w:rPr>
+          <w:rFonts w:ascii="Courier New" w:hAnsi="Courier New" w:cs="Courier New"/>
+        </w:rPr>
+      </w:pPr>
+      <w:r>
+        <w:rPr>
+          <w:rFonts w:ascii="Courier New" w:hAnsi="Courier New" w:cs="Courier New"/>
+        </w:rPr>
+        <w:tab/>
+        <w:t>--NEXT ORDER COST---</w:t>
+      </w:r>
+      <w:r>
+        <w:rPr>
+          <w:rFonts w:ascii="Courier New" w:hAnsi="Courier New" w:cs="Courier New"/>
+        </w:rPr>
+        <w:tab/>
+      </w:r>
+    </w:p>
+    <w:p>
+      <w:pPr>
+        <w:pStyle w:val="PlainText"/>
+        <w:rPr>
+          <w:rFonts w:ascii="Courier New" w:hAnsi="Courier New" w:cs="Courier New"/>
+        </w:rPr>
+      </w:pPr>
+      <w:r>
+        <w:rPr>
+          <w:rFonts w:ascii="Courier New" w:hAnsi="Courier New" w:cs="Courier New"/>
+        </w:rPr>
+        <w:tab/>
+        <w:t xml:space="preserve">        425         </w:t>
+      </w:r>
+      <w:r>
+        <w:rPr>
+          <w:rFonts w:ascii="Courier New" w:hAnsi="Courier New" w:cs="Courier New"/>
+        </w:rPr>
+        <w:tab/>
+      </w:r>
+    </w:p>
+    <w:p>
+      <w:pPr>
+        <w:pStyle w:val="PlainText"/>
+        <w:rPr>
+          <w:rFonts w:ascii="Courier New" w:hAnsi="Courier New" w:cs="Courier New"/>
+        </w:rPr>
+      </w:pPr>
+    </w:p>
+    <w:p>
+      <w:pPr>
+        <w:pStyle w:val="PlainText"/>
+        <w:rPr>
+          <w:rFonts w:ascii="Courier New" w:hAnsi="Courier New" w:cs="Courier New"/>
+        </w:rPr>
+      </w:pPr>
+    </w:p>
+    <w:p>
+      <w:pPr>
+        <w:pStyle w:val="PlainText"/>
+        <w:rPr>
+          <w:rFonts w:ascii="Courier New" w:hAnsi="Courier New" w:cs="Courier New"/>
+        </w:rPr>
+      </w:pPr>
+      <w:r>
+        <w:rPr>
+          <w:rFonts w:ascii="Courier New" w:hAnsi="Courier New" w:cs="Courier New"/>
+        </w:rPr>
+        <w:t>ITEM BQ-5543</w:t>
+      </w:r>
+    </w:p>
+    <w:p>
+      <w:pPr>
+        <w:pStyle w:val="PlainText"/>
+        <w:rPr>
+          <w:rFonts w:ascii="Courier New" w:hAnsi="Courier New" w:cs="Courier New"/>
+        </w:rPr>
+      </w:pPr>
+      <w:r>
+        <w:rPr>
+          <w:rFonts w:ascii="Courier New" w:hAnsi="Courier New" w:cs="Courier New"/>
+        </w:rPr>
+        <w:tab/>
+        <w:t>-QUANTITY IN STOCK--</w:t>
+      </w:r>
+      <w:r>
+        <w:rPr>
+          <w:rFonts w:ascii="Courier New" w:hAnsi="Courier New" w:cs="Courier New"/>
+        </w:rPr>
+        <w:tab/>
+        <w:t>-QUANTITY REQUESTED-</w:t>
+      </w:r>
+      <w:r>
+        <w:rPr>
+          <w:rFonts w:ascii="Courier New" w:hAnsi="Courier New" w:cs="Courier New"/>
+        </w:rPr>
+        <w:tab/>
+      </w:r>
+    </w:p>
+    <w:p>
+      <w:pPr>
+        <w:pStyle w:val="PlainText"/>
+        <w:rPr>
+          <w:rFonts w:ascii="Courier New" w:hAnsi="Courier New" w:cs="Courier New"/>
+        </w:rPr>
+      </w:pPr>
+      <w:r>
+        <w:rPr>
+          <w:rFonts w:ascii="Courier New" w:hAnsi="Courier New" w:cs="Courier New"/>
+        </w:rPr>
+        <w:tab/>
+        <w:t xml:space="preserve">         30         </w:t>
+      </w:r>
+      <w:r>
+        <w:rPr>
+          <w:rFonts w:ascii="Courier New" w:hAnsi="Courier New" w:cs="Courier New"/>
+        </w:rPr>
+        <w:tab/>
+        <w:t xml:space="preserve">         5          </w:t>
+      </w:r>
+      <w:r>
+        <w:rPr>
+          <w:rFonts w:ascii="Courier New" w:hAnsi="Courier New" w:cs="Courier New"/>
+        </w:rPr>
+        <w:tab/>
+      </w:r>
+    </w:p>
+    <w:p>
+      <w:pPr>
+        <w:pStyle w:val="PlainText"/>
+        <w:rPr>
+          <w:rFonts w:ascii="Courier New" w:hAnsi="Courier New" w:cs="Courier New"/>
+        </w:rPr>
+      </w:pPr>
+    </w:p>
+    <w:p>
+      <w:pPr>
+        <w:pStyle w:val="PlainText"/>
+        <w:rPr>
+          <w:rFonts w:ascii="Courier New" w:hAnsi="Courier New" w:cs="Courier New"/>
+        </w:rPr>
+      </w:pPr>
+      <w:r>
+        <w:rPr>
+          <w:rFonts w:ascii="Courier New" w:hAnsi="Courier New" w:cs="Courier New"/>
+        </w:rPr>
+        <w:tab/>
+        <w:t>-----UNIT PRICE-----</w:t>
+      </w:r>
+      <w:r>
+        <w:rPr>
+          <w:rFonts w:ascii="Courier New" w:hAnsi="Courier New" w:cs="Courier New"/>
+        </w:rPr>
+        <w:tab/>
+        <w:t>-------VENDOR-------</w:t>
+      </w:r>
+      <w:r>
+        <w:rPr>
+          <w:rFonts w:ascii="Courier New" w:hAnsi="Courier New" w:cs="Courier New"/>
+        </w:rPr>
+        <w:tab/>
+      </w:r>
+    </w:p>
+    <w:p>
+      <w:pPr>
+        <w:pStyle w:val="PlainText"/>
+        <w:rPr>
+          <w:rFonts w:ascii="Courier New" w:hAnsi="Courier New" w:cs="Courier New"/>
+        </w:rPr>
+      </w:pPr>
+      <w:r>
+        <w:rPr>
+          <w:rFonts w:ascii="Courier New" w:hAnsi="Courier New" w:cs="Courier New"/>
+        </w:rPr>
+        <w:tab/>
+        <w:t xml:space="preserve">         18         </w:t>
+      </w:r>
+      <w:r>
+        <w:rPr>
+          <w:rFonts w:ascii="Courier New" w:hAnsi="Courier New" w:cs="Courier New"/>
+        </w:rPr>
+        <w:tab/>
+        <w:t xml:space="preserve">     KitchenAid     </w:t>
+      </w:r>
+      <w:r>
+        <w:rPr>
+          <w:rFonts w:ascii="Courier New" w:hAnsi="Courier New" w:cs="Courier New"/>
+        </w:rPr>
+        <w:tab/>
+      </w:r>
+    </w:p>
+    <w:p>
+      <w:pPr>
+        <w:pStyle w:val="PlainText"/>
+        <w:rPr>
+          <w:rFonts w:ascii="Courier New" w:hAnsi="Courier New" w:cs="Courier New"/>
+        </w:rPr>
+      </w:pPr>
+    </w:p>
+    <w:p>
+      <w:pPr>
+        <w:pStyle w:val="PlainText"/>
+        <w:rPr>
+          <w:rFonts w:ascii="Courier New" w:hAnsi="Courier New" w:cs="Courier New"/>
+        </w:rPr>
+      </w:pPr>
+      <w:r>
+        <w:rPr>
+          <w:rFonts w:ascii="Courier New" w:hAnsi="Courier New" w:cs="Courier New"/>
+        </w:rPr>
+        <w:tab/>
+        <w:t>--LAST INVENTORIED--</w:t>
+      </w:r>
+      <w:r>
+        <w:rPr>
+          <w:rFonts w:ascii="Courier New" w:hAnsi="Courier New" w:cs="Courier New"/>
+        </w:rPr>
+        <w:tab/>
+        <w:t>ORDER SIZE IN UNITS-</w:t>
+      </w:r>
+      <w:r>
+        <w:rPr>
+          <w:rFonts w:ascii="Courier New" w:hAnsi="Courier New" w:cs="Courier New"/>
+        </w:rPr>
+        <w:tab/>
+      </w:r>
+    </w:p>
+    <w:p>
+      <w:pPr>
+        <w:pStyle w:val="PlainText"/>
+        <w:rPr>
+          <w:rFonts w:ascii="Courier New" w:hAnsi="Courier New" w:cs="Courier New"/>
+        </w:rPr>
+      </w:pPr>
+      <w:r>
+        <w:rPr>
+          <w:rFonts w:ascii="Courier New" w:hAnsi="Courier New" w:cs="Courier New"/>
+        </w:rPr>
+        <w:tab/>
+        <w:t xml:space="preserve">  2025-10-19 15:32  </w:t>
+      </w:r>
+      <w:r>
+        <w:rPr>
+          <w:rFonts w:ascii="Courier New" w:hAnsi="Courier New" w:cs="Courier New"/>
+        </w:rPr>
+        <w:tab/>
+        <w:t xml:space="preserve">         10         </w:t>
+      </w:r>
+      <w:r>
+        <w:rPr>
+          <w:rFonts w:ascii="Courier New" w:hAnsi="Courier New" w:cs="Courier New"/>
+        </w:rPr>
+        <w:tab/>
+      </w:r>
+    </w:p>
+    <w:p>
+      <w:pPr>
+        <w:pStyle w:val="PlainText"/>
+        <w:rPr>
+          <w:rFonts w:ascii="Courier New" w:hAnsi="Courier New" w:cs="Courier New"/>
+        </w:rPr>
+      </w:pPr>
+    </w:p>
+    <w:p>
+      <w:pPr>
+        <w:pStyle w:val="PlainText"/>
+        <w:rPr>
+          <w:rFonts w:ascii="Courier New" w:hAnsi="Courier New" w:cs="Courier New"/>
+        </w:rPr>
+      </w:pPr>
+      <w:r>
+        <w:rPr>
+          <w:rFonts w:ascii="Courier New" w:hAnsi="Courier New" w:cs="Courier New"/>
+        </w:rPr>
+        <w:tab/>
+        <w:t>---QUANTITY SHORT---</w:t>
+      </w:r>
+      <w:r>
+        <w:rPr>
+          <w:rFonts w:ascii="Courier New" w:hAnsi="Courier New" w:cs="Courier New"/>
+        </w:rPr>
+        <w:tab/>
+        <w:t>-QUANTITY TO ORDER--</w:t>
+      </w:r>
+      <w:r>
+        <w:rPr>
+          <w:rFonts w:ascii="Courier New" w:hAnsi="Courier New" w:cs="Courier New"/>
+        </w:rPr>
+        <w:tab/>
+      </w:r>
+    </w:p>
+    <w:p>
+      <w:pPr>
+        <w:pStyle w:val="PlainText"/>
+        <w:rPr>
+          <w:rFonts w:ascii="Courier New" w:hAnsi="Courier New" w:cs="Courier New"/>
+        </w:rPr>
+      </w:pPr>
+      <w:r>
+        <w:rPr>
+          <w:rFonts w:ascii="Courier New" w:hAnsi="Courier New" w:cs="Courier New"/>
+        </w:rPr>
+        <w:tab/>
+        <w:t xml:space="preserve">         0          </w:t>
+      </w:r>
+      <w:r>
+        <w:rPr>
+          <w:rFonts w:ascii="Courier New" w:hAnsi="Courier New" w:cs="Courier New"/>
+        </w:rPr>
+        <w:tab/>
+        <w:t xml:space="preserve">         0          </w:t>
+      </w:r>
+      <w:r>
+        <w:rPr>
+          <w:rFonts w:ascii="Courier New" w:hAnsi="Courier New" w:cs="Courier New"/>
+        </w:rPr>
+        <w:tab/>
+      </w:r>
+    </w:p>
+    <w:p>
+      <w:pPr>
+        <w:pStyle w:val="PlainText"/>
+        <w:rPr>
+          <w:rFonts w:ascii="Courier New" w:hAnsi="Courier New" w:cs="Courier New"/>
+        </w:rPr>
+      </w:pPr>
+    </w:p>
+    <w:p>
+      <w:pPr>
+        <w:pStyle w:val="PlainText"/>
+        <w:rPr>
+          <w:rFonts w:ascii="Courier New" w:hAnsi="Courier New" w:cs="Courier New"/>
+        </w:rPr>
+      </w:pPr>
+      <w:r>
+        <w:rPr>
+          <w:rFonts w:ascii="Courier New" w:hAnsi="Courier New" w:cs="Courier New"/>
+        </w:rPr>
+        <w:tab/>
+        <w:t>--NEXT ORDER COST---</w:t>
+      </w:r>
+      <w:r>
+        <w:rPr>
+          <w:rFonts w:ascii="Courier New" w:hAnsi="Courier New" w:cs="Courier New"/>
+        </w:rPr>
+        <w:tab/>
+      </w:r>
+    </w:p>
+    <w:p>
+      <w:pPr>
+        <w:pStyle w:val="PlainText"/>
+        <w:rPr>
+          <w:rFonts w:ascii="Courier New" w:hAnsi="Courier New" w:cs="Courier New"/>
+        </w:rPr>
+      </w:pPr>
+      <w:r>
+        <w:rPr>
+          <w:rFonts w:ascii="Courier New" w:hAnsi="Courier New" w:cs="Courier New"/>
+        </w:rPr>
+        <w:tab/>
+        <w:t xml:space="preserve">         0          </w:t>
+      </w:r>
+      <w:r>
+        <w:rPr>
+          <w:rFonts w:ascii="Courier New" w:hAnsi="Courier New" w:cs="Courier New"/>
+        </w:rPr>
+        <w:tab/>
+      </w:r>
+    </w:p>
+    <w:p>
+      <w:pPr>
+        <w:pStyle w:val="PlainText"/>
+        <w:rPr>
+          <w:rFonts w:ascii="Courier New" w:hAnsi="Courier New" w:cs="Courier New"/>
+        </w:rPr>
+      </w:pPr>
+    </w:p>
+    <w:p>
+      <w:pPr>
+        <w:pStyle w:val="PlainText"/>
+        <w:rPr>
+          <w:rFonts w:ascii="Courier New" w:hAnsi="Courier New" w:cs="Courier New"/>
+        </w:rPr>
+      </w:pPr>
+    </w:p>
+    <w:p>
+      <w:pPr>
+        <w:pStyle w:val="PlainText"/>
+        <w:rPr>
+          <w:rFonts w:ascii="Courier New" w:hAnsi="Courier New" w:cs="Courier New"/>
+        </w:rPr>
+      </w:pPr>
+      <w:r>
+        <w:rPr>
+          <w:rFonts w:ascii="Courier New" w:hAnsi="Courier New" w:cs="Courier New"/>
+        </w:rPr>
+        <w:t>ITEM SGX04QAB</w:t>
+      </w:r>
+    </w:p>
+    <w:p>
+      <w:pPr>
+        <w:pStyle w:val="PlainText"/>
+        <w:rPr>
+          <w:rFonts w:ascii="Courier New" w:hAnsi="Courier New" w:cs="Courier New"/>
+        </w:rPr>
+      </w:pPr>
+      <w:r>
+        <w:rPr>
+          <w:rFonts w:ascii="Courier New" w:hAnsi="Courier New" w:cs="Courier New"/>
+        </w:rPr>
+        <w:tab/>
+        <w:t>-QUANTITY IN STOCK--</w:t>
+      </w:r>
+      <w:r>
+        <w:rPr>
+          <w:rFonts w:ascii="Courier New" w:hAnsi="Courier New" w:cs="Courier New"/>
+        </w:rPr>
+        <w:tab/>
+        <w:t>-QUANTITY REQUESTED-</w:t>
+      </w:r>
+      <w:r>
+        <w:rPr>
+          <w:rFonts w:ascii="Courier New" w:hAnsi="Courier New" w:cs="Courier New"/>
+        </w:rPr>
+        <w:tab/>
+      </w:r>
+    </w:p>
+    <w:p>
+      <w:pPr>
+        <w:pStyle w:val="PlainText"/>
+        <w:rPr>
+          <w:rFonts w:ascii="Courier New" w:hAnsi="Courier New" w:cs="Courier New"/>
+        </w:rPr>
+      </w:pPr>
+      <w:r>
+        <w:rPr>
+          <w:rFonts w:ascii="Courier New" w:hAnsi="Courier New" w:cs="Courier New"/>
+        </w:rPr>
+        <w:tab/>
+        <w:t xml:space="preserve">         50         </w:t>
+      </w:r>
+      <w:r>
+        <w:rPr>
+          <w:rFonts w:ascii="Courier New" w:hAnsi="Courier New" w:cs="Courier New"/>
+        </w:rPr>
+        <w:tab/>
+        <w:t xml:space="preserve">         10         </w:t>
+      </w:r>
+      <w:r>
+        <w:rPr>
+          <w:rFonts w:ascii="Courier New" w:hAnsi="Courier New" w:cs="Courier New"/>
+        </w:rPr>
+        <w:tab/>
+      </w:r>
+    </w:p>
+    <w:p>
+      <w:pPr>
+        <w:pStyle w:val="PlainText"/>
+        <w:rPr>
+          <w:rFonts w:ascii="Courier New" w:hAnsi="Courier New" w:cs="Courier New"/>
+        </w:rPr>
+      </w:pPr>
+    </w:p>
+    <w:p>
+      <w:pPr>
+        <w:pStyle w:val="PlainText"/>
+        <w:rPr>
+          <w:rFonts w:ascii="Courier New" w:hAnsi="Courier New" w:cs="Courier New"/>
+        </w:rPr>
+      </w:pPr>
+      <w:r>
+        <w:rPr>
+          <w:rFonts w:ascii="Courier New" w:hAnsi="Courier New" w:cs="Courier New"/>
+        </w:rPr>
+        <w:tab/>
+        <w:t>-----UNIT PRICE-----</w:t>
+      </w:r>
+      <w:r>
+        <w:rPr>
+          <w:rFonts w:ascii="Courier New" w:hAnsi="Courier New" w:cs="Courier New"/>
+        </w:rPr>
+        <w:tab/>
+        <w:t>-------VENDOR-------</w:t>
+      </w:r>
+      <w:r>
+        <w:rPr>
+          <w:rFonts w:ascii="Courier New" w:hAnsi="Courier New" w:cs="Courier New"/>
+        </w:rPr>
+        <w:tab/>
+      </w:r>
+    </w:p>
+    <w:p>
+      <w:pPr>
+        <w:pStyle w:val="PlainText"/>
+        <w:rPr>
+          <w:rFonts w:ascii="Courier New" w:hAnsi="Courier New" w:cs="Courier New"/>
+        </w:rPr>
+      </w:pPr>
+      <w:r>
+        <w:rPr>
+          <w:rFonts w:ascii="Courier New" w:hAnsi="Courier New" w:cs="Courier New"/>
+        </w:rPr>
+        <w:tab/>
+        <w:t xml:space="preserve">         5          </w:t>
+      </w:r>
+      <w:r>
+        <w:rPr>
+          <w:rFonts w:ascii="Courier New" w:hAnsi="Courier New" w:cs="Courier New"/>
+        </w:rPr>
+        <w:tab/>
+        <w:t xml:space="preserve">      Samsung       </w:t>
+      </w:r>
+      <w:r>
+        <w:rPr>
+          <w:rFonts w:ascii="Courier New" w:hAnsi="Courier New" w:cs="Courier New"/>
+        </w:rPr>
+        <w:tab/>
+      </w:r>
+    </w:p>
+    <w:p>
+      <w:pPr>
+        <w:pStyle w:val="PlainText"/>
+        <w:rPr>
+          <w:rFonts w:ascii="Courier New" w:hAnsi="Courier New" w:cs="Courier New"/>
+        </w:rPr>
+      </w:pPr>
+    </w:p>
+    <w:p>
+      <w:pPr>
+        <w:pStyle w:val="PlainText"/>
+        <w:rPr>
+          <w:rFonts w:ascii="Courier New" w:hAnsi="Courier New" w:cs="Courier New"/>
+        </w:rPr>
+      </w:pPr>
+      <w:r>
+        <w:rPr>
+          <w:rFonts w:ascii="Courier New" w:hAnsi="Courier New" w:cs="Courier New"/>
+        </w:rPr>
+        <w:tab/>
+        <w:t>--LAST INVENTORIED--</w:t>
+      </w:r>
+      <w:r>
+        <w:rPr>
+          <w:rFonts w:ascii="Courier New" w:hAnsi="Courier New" w:cs="Courier New"/>
+        </w:rPr>
+        <w:tab/>
+        <w:t>ORDER SIZE IN UNITS-</w:t>
+      </w:r>
+      <w:r>
+        <w:rPr>
+          <w:rFonts w:ascii="Courier New" w:hAnsi="Courier New" w:cs="Courier New"/>
+        </w:rPr>
+        <w:tab/>
+      </w:r>
+    </w:p>
+    <w:p>
+      <w:pPr>
+        <w:pStyle w:val="PlainText"/>
+        <w:rPr>
+          <w:rFonts w:ascii="Courier New" w:hAnsi="Courier New" w:cs="Courier New"/>
+        </w:rPr>
+      </w:pPr>
+      <w:r>
+        <w:rPr>
+          <w:rFonts w:ascii="Courier New" w:hAnsi="Courier New" w:cs="Courier New"/>
+        </w:rPr>
+        <w:tab/>
+        <w:t xml:space="preserve">  2025-10-16 17:33  </w:t>
+      </w:r>
+      <w:r>
+        <w:rPr>
+          <w:rFonts w:ascii="Courier New" w:hAnsi="Courier New" w:cs="Courier New"/>
+        </w:rPr>
+        <w:tab/>
+        <w:t xml:space="preserve">        100         </w:t>
+      </w:r>
+      <w:r>
+        <w:rPr>
+          <w:rFonts w:ascii="Courier New" w:hAnsi="Courier New" w:cs="Courier New"/>
+        </w:rPr>
+        <w:tab/>
+      </w:r>
+    </w:p>
+    <w:p>
+      <w:pPr>
+        <w:pStyle w:val="PlainText"/>
+        <w:rPr>
+          <w:rFonts w:ascii="Courier New" w:hAnsi="Courier New" w:cs="Courier New"/>
+        </w:rPr>
+      </w:pPr>
+    </w:p>
+    <w:p>
+      <w:pPr>
+        <w:pStyle w:val="PlainText"/>
+        <w:rPr>
+          <w:rFonts w:ascii="Courier New" w:hAnsi="Courier New" w:cs="Courier New"/>
+        </w:rPr>
+      </w:pPr>
+      <w:r>
+        <w:rPr>
+          <w:rFonts w:ascii="Courier New" w:hAnsi="Courier New" w:cs="Courier New"/>
+        </w:rPr>
+        <w:tab/>
+        <w:t>---QUANTITY SHORT---</w:t>
+      </w:r>
+      <w:r>
+        <w:rPr>
+          <w:rFonts w:ascii="Courier New" w:hAnsi="Courier New" w:cs="Courier New"/>
+        </w:rPr>
+        <w:tab/>
+        <w:t>-QUANTITY TO ORDER--</w:t>
+      </w:r>
+      <w:r>
+        <w:rPr>
+          <w:rFonts w:ascii="Courier New" w:hAnsi="Courier New" w:cs="Courier New"/>
+        </w:rPr>
+        <w:tab/>
+      </w:r>
+    </w:p>
+    <w:p>
+      <w:pPr>
+        <w:pStyle w:val="PlainText"/>
+        <w:rPr>
+          <w:rFonts w:ascii="Courier New" w:hAnsi="Courier New" w:cs="Courier New"/>
+        </w:rPr>
+      </w:pPr>
+      <w:r>
+        <w:rPr>
+          <w:rFonts w:ascii="Courier New" w:hAnsi="Courier New" w:cs="Courier New"/>
+        </w:rPr>
+        <w:tab/>
+        <w:t xml:space="preserve">         0          </w:t>
+      </w:r>
+      <w:r>
+        <w:rPr>
+          <w:rFonts w:ascii="Courier New" w:hAnsi="Courier New" w:cs="Courier New"/>
+        </w:rPr>
+        <w:tab/>
+        <w:t xml:space="preserve">         0          </w:t>
+      </w:r>
+      <w:r>
+        <w:rPr>
+          <w:rFonts w:ascii="Courier New" w:hAnsi="Courier New" w:cs="Courier New"/>
+        </w:rPr>
+        <w:tab/>
+      </w:r>
+    </w:p>
+    <w:p>
+      <w:pPr>
+        <w:pStyle w:val="PlainText"/>
+        <w:rPr>
+          <w:rFonts w:ascii="Courier New" w:hAnsi="Courier New" w:cs="Courier New"/>
+        </w:rPr>
+      </w:pPr>
+    </w:p>
+    <w:p>
+      <w:pPr>
+        <w:pStyle w:val="PlainText"/>
+        <w:rPr>
+          <w:rFonts w:ascii="Courier New" w:hAnsi="Courier New" w:cs="Courier New"/>
+        </w:rPr>
+      </w:pPr>
+      <w:r>
+        <w:rPr>
+          <w:rFonts w:ascii="Courier New" w:hAnsi="Courier New" w:cs="Courier New"/>
+        </w:rPr>
+        <w:tab/>
+        <w:t>--NEXT ORDER COST---</w:t>
+      </w:r>
+      <w:r>
+        <w:rPr>
+          <w:rFonts w:ascii="Courier New" w:hAnsi="Courier New" w:cs="Courier New"/>
+        </w:rPr>
+        <w:tab/>
+      </w:r>
+    </w:p>
+    <w:p>
+      <w:pPr>
+        <w:pStyle w:val="PlainText"/>
+        <w:rPr>
+          <w:rFonts w:ascii="Courier New" w:hAnsi="Courier New" w:cs="Courier New"/>
+        </w:rPr>
+      </w:pPr>
+      <w:r>
+        <w:rPr>
+          <w:rFonts w:ascii="Courier New" w:hAnsi="Courier New" w:cs="Courier New"/>
+        </w:rPr>
+        <w:tab/>
+        <w:t xml:space="preserve">         0          </w:t>
+      </w:r>
+      <w:r>
+        <w:rPr>
+          <w:rFonts w:ascii="Courier New" w:hAnsi="Courier New" w:cs="Courier New"/>
+        </w:rPr>
+        <w:tab/>
+      </w:r>
+    </w:p>
+    <w:p>
+      <w:pPr>
+        <w:pStyle w:val="PlainText"/>
+        <w:rPr>
+          <w:rFonts w:ascii="Courier New" w:hAnsi="Courier New" w:cs="Courier New"/>
+        </w:rPr>
+      </w:pPr>
+    </w:p>
+    <w:p>
+      <w:pPr>
+        <w:pStyle w:val="PlainText"/>
+        <w:rPr>
+          <w:rFonts w:ascii="Courier New" w:hAnsi="Courier New" w:cs="Courier New"/>
+        </w:rPr>
+      </w:pPr>
+    </w:p>
+    <w:p>
+      <w:pPr>
         <w:rPr>
           <w:b/>
           <w:bCs/>
@@ -758,6 +2421,684 @@
         </w:rPr>
         <w:t>report:</w:t>
       </w:r>
+    </w:p>
+    <w:p>
+      <w:pPr>
+        <w:pStyle w:val="PlainText"/>
+        <w:rPr>
+          <w:rFonts w:ascii="Courier New" w:hAnsi="Courier New" w:cs="Courier New"/>
+        </w:rPr>
+      </w:pPr>
+      <w:r>
+        <w:rPr>
+          <w:rFonts w:ascii="Courier New" w:hAnsi="Courier New" w:cs="Courier New"/>
+        </w:rPr>
+        <w:t>--- PARTS THAT ARE OUT OF STOCK OR HAVE LOWER STOCK THAN REQUESTED BY TECHNICIANS ---</w:t>
+      </w:r>
+    </w:p>
+    <w:p>
+      <w:pPr>
+        <w:pStyle w:val="PlainText"/>
+        <w:rPr>
+          <w:rFonts w:ascii="Courier New" w:hAnsi="Courier New" w:cs="Courier New"/>
+        </w:rPr>
+      </w:pPr>
+      <w:r>
+        <w:rPr>
+          <w:rFonts w:ascii="Courier New" w:hAnsi="Courier New" w:cs="Courier New"/>
+        </w:rPr>
+        <w:t>ITEM PRT-109D</w:t>
+      </w:r>
+    </w:p>
+    <w:p>
+      <w:pPr>
+        <w:pStyle w:val="PlainText"/>
+        <w:rPr>
+          <w:rFonts w:ascii="Courier New" w:hAnsi="Courier New" w:cs="Courier New"/>
+        </w:rPr>
+      </w:pPr>
+      <w:r>
+        <w:rPr>
+          <w:rFonts w:ascii="Courier New" w:hAnsi="Courier New" w:cs="Courier New"/>
+        </w:rPr>
+        <w:tab/>
+        <w:t>-QUANTITY IN STOCK--</w:t>
+      </w:r>
+      <w:r>
+        <w:rPr>
+          <w:rFonts w:ascii="Courier New" w:hAnsi="Courier New" w:cs="Courier New"/>
+        </w:rPr>
+        <w:tab/>
+        <w:t>-QUANTITY REQUESTED-</w:t>
+      </w:r>
+      <w:r>
+        <w:rPr>
+          <w:rFonts w:ascii="Courier New" w:hAnsi="Courier New" w:cs="Courier New"/>
+        </w:rPr>
+        <w:tab/>
+      </w:r>
+    </w:p>
+    <w:p>
+      <w:pPr>
+        <w:pStyle w:val="PlainText"/>
+        <w:rPr>
+          <w:rFonts w:ascii="Courier New" w:hAnsi="Courier New" w:cs="Courier New"/>
+        </w:rPr>
+      </w:pPr>
+      <w:r>
+        <w:rPr>
+          <w:rFonts w:ascii="Courier New" w:hAnsi="Courier New" w:cs="Courier New"/>
+        </w:rPr>
+        <w:tab/>
+        <w:t xml:space="preserve">         5          </w:t>
+      </w:r>
+      <w:r>
+        <w:rPr>
+          <w:rFonts w:ascii="Courier New" w:hAnsi="Courier New" w:cs="Courier New"/>
+        </w:rPr>
+        <w:tab/>
+        <w:t xml:space="preserve">         7          </w:t>
+      </w:r>
+      <w:r>
+        <w:rPr>
+          <w:rFonts w:ascii="Courier New" w:hAnsi="Courier New" w:cs="Courier New"/>
+        </w:rPr>
+        <w:tab/>
+      </w:r>
+    </w:p>
+    <w:p>
+      <w:pPr>
+        <w:pStyle w:val="PlainText"/>
+        <w:rPr>
+          <w:rFonts w:ascii="Courier New" w:hAnsi="Courier New" w:cs="Courier New"/>
+        </w:rPr>
+      </w:pPr>
+    </w:p>
+    <w:p>
+      <w:pPr>
+        <w:pStyle w:val="PlainText"/>
+        <w:rPr>
+          <w:rFonts w:ascii="Courier New" w:hAnsi="Courier New" w:cs="Courier New"/>
+        </w:rPr>
+      </w:pPr>
+      <w:r>
+        <w:rPr>
+          <w:rFonts w:ascii="Courier New" w:hAnsi="Courier New" w:cs="Courier New"/>
+        </w:rPr>
+        <w:tab/>
+        <w:t>-----UNIT PRICE-----</w:t>
+      </w:r>
+      <w:r>
+        <w:rPr>
+          <w:rFonts w:ascii="Courier New" w:hAnsi="Courier New" w:cs="Courier New"/>
+        </w:rPr>
+        <w:tab/>
+        <w:t>-------VENDOR-------</w:t>
+      </w:r>
+      <w:r>
+        <w:rPr>
+          <w:rFonts w:ascii="Courier New" w:hAnsi="Courier New" w:cs="Courier New"/>
+        </w:rPr>
+        <w:tab/>
+      </w:r>
+    </w:p>
+    <w:p>
+      <w:pPr>
+        <w:pStyle w:val="PlainText"/>
+        <w:rPr>
+          <w:rFonts w:ascii="Courier New" w:hAnsi="Courier New" w:cs="Courier New"/>
+        </w:rPr>
+      </w:pPr>
+      <w:r>
+        <w:rPr>
+          <w:rFonts w:ascii="Courier New" w:hAnsi="Courier New" w:cs="Courier New"/>
+        </w:rPr>
+        <w:tab/>
+        <w:t xml:space="preserve">         14         </w:t>
+      </w:r>
+      <w:r>
+        <w:rPr>
+          <w:rFonts w:ascii="Courier New" w:hAnsi="Courier New" w:cs="Courier New"/>
+        </w:rPr>
+        <w:tab/>
+        <w:t xml:space="preserve">         LG         </w:t>
+      </w:r>
+      <w:r>
+        <w:rPr>
+          <w:rFonts w:ascii="Courier New" w:hAnsi="Courier New" w:cs="Courier New"/>
+        </w:rPr>
+        <w:tab/>
+      </w:r>
+    </w:p>
+    <w:p>
+      <w:pPr>
+        <w:pStyle w:val="PlainText"/>
+        <w:rPr>
+          <w:rFonts w:ascii="Courier New" w:hAnsi="Courier New" w:cs="Courier New"/>
+        </w:rPr>
+      </w:pPr>
+    </w:p>
+    <w:p>
+      <w:pPr>
+        <w:pStyle w:val="PlainText"/>
+        <w:rPr>
+          <w:rFonts w:ascii="Courier New" w:hAnsi="Courier New" w:cs="Courier New"/>
+        </w:rPr>
+      </w:pPr>
+      <w:r>
+        <w:rPr>
+          <w:rFonts w:ascii="Courier New" w:hAnsi="Courier New" w:cs="Courier New"/>
+        </w:rPr>
+        <w:tab/>
+        <w:t>--LAST INVENTORIED--</w:t>
+      </w:r>
+      <w:r>
+        <w:rPr>
+          <w:rFonts w:ascii="Courier New" w:hAnsi="Courier New" w:cs="Courier New"/>
+        </w:rPr>
+        <w:tab/>
+        <w:t>ORDER SIZE IN UNITS-</w:t>
+      </w:r>
+      <w:r>
+        <w:rPr>
+          <w:rFonts w:ascii="Courier New" w:hAnsi="Courier New" w:cs="Courier New"/>
+        </w:rPr>
+        <w:tab/>
+      </w:r>
+    </w:p>
+    <w:p>
+      <w:pPr>
+        <w:pStyle w:val="PlainText"/>
+        <w:rPr>
+          <w:rFonts w:ascii="Courier New" w:hAnsi="Courier New" w:cs="Courier New"/>
+        </w:rPr>
+      </w:pPr>
+      <w:r>
+        <w:rPr>
+          <w:rFonts w:ascii="Courier New" w:hAnsi="Courier New" w:cs="Courier New"/>
+        </w:rPr>
+        <w:tab/>
+        <w:t xml:space="preserve">  2025-10-17 22:24  </w:t>
+      </w:r>
+      <w:r>
+        <w:rPr>
+          <w:rFonts w:ascii="Courier New" w:hAnsi="Courier New" w:cs="Courier New"/>
+        </w:rPr>
+        <w:tab/>
+        <w:t xml:space="preserve">         30         </w:t>
+      </w:r>
+      <w:r>
+        <w:rPr>
+          <w:rFonts w:ascii="Courier New" w:hAnsi="Courier New" w:cs="Courier New"/>
+        </w:rPr>
+        <w:tab/>
+      </w:r>
+    </w:p>
+    <w:p>
+      <w:pPr>
+        <w:pStyle w:val="PlainText"/>
+        <w:rPr>
+          <w:rFonts w:ascii="Courier New" w:hAnsi="Courier New" w:cs="Courier New"/>
+        </w:rPr>
+      </w:pPr>
+    </w:p>
+    <w:p>
+      <w:pPr>
+        <w:pStyle w:val="PlainText"/>
+        <w:rPr>
+          <w:rFonts w:ascii="Courier New" w:hAnsi="Courier New" w:cs="Courier New"/>
+        </w:rPr>
+      </w:pPr>
+      <w:r>
+        <w:rPr>
+          <w:rFonts w:ascii="Courier New" w:hAnsi="Courier New" w:cs="Courier New"/>
+        </w:rPr>
+        <w:tab/>
+        <w:t>---QUANTITY SHORT---</w:t>
+      </w:r>
+      <w:r>
+        <w:rPr>
+          <w:rFonts w:ascii="Courier New" w:hAnsi="Courier New" w:cs="Courier New"/>
+        </w:rPr>
+        <w:tab/>
+        <w:t>-QUANTITY TO ORDER--</w:t>
+      </w:r>
+      <w:r>
+        <w:rPr>
+          <w:rFonts w:ascii="Courier New" w:hAnsi="Courier New" w:cs="Courier New"/>
+        </w:rPr>
+        <w:tab/>
+      </w:r>
+    </w:p>
+    <w:p>
+      <w:pPr>
+        <w:pStyle w:val="PlainText"/>
+        <w:rPr>
+          <w:rFonts w:ascii="Courier New" w:hAnsi="Courier New" w:cs="Courier New"/>
+        </w:rPr>
+      </w:pPr>
+      <w:r>
+        <w:rPr>
+          <w:rFonts w:ascii="Courier New" w:hAnsi="Courier New" w:cs="Courier New"/>
+        </w:rPr>
+        <w:tab/>
+        <w:t xml:space="preserve">         2          </w:t>
+      </w:r>
+      <w:r>
+        <w:rPr>
+          <w:rFonts w:ascii="Courier New" w:hAnsi="Courier New" w:cs="Courier New"/>
+        </w:rPr>
+        <w:tab/>
+        <w:t xml:space="preserve">         30         </w:t>
+      </w:r>
+      <w:r>
+        <w:rPr>
+          <w:rFonts w:ascii="Courier New" w:hAnsi="Courier New" w:cs="Courier New"/>
+        </w:rPr>
+        <w:tab/>
+      </w:r>
+    </w:p>
+    <w:p>
+      <w:pPr>
+        <w:pStyle w:val="PlainText"/>
+        <w:rPr>
+          <w:rFonts w:ascii="Courier New" w:hAnsi="Courier New" w:cs="Courier New"/>
+        </w:rPr>
+      </w:pPr>
+    </w:p>
+    <w:p>
+      <w:pPr>
+        <w:pStyle w:val="PlainText"/>
+        <w:rPr>
+          <w:rFonts w:ascii="Courier New" w:hAnsi="Courier New" w:cs="Courier New"/>
+        </w:rPr>
+      </w:pPr>
+      <w:r>
+        <w:rPr>
+          <w:rFonts w:ascii="Courier New" w:hAnsi="Courier New" w:cs="Courier New"/>
+        </w:rPr>
+        <w:tab/>
+        <w:t>--NEXT ORDER COST---</w:t>
+      </w:r>
+      <w:r>
+        <w:rPr>
+          <w:rFonts w:ascii="Courier New" w:hAnsi="Courier New" w:cs="Courier New"/>
+        </w:rPr>
+        <w:tab/>
+      </w:r>
+    </w:p>
+    <w:p>
+      <w:pPr>
+        <w:pStyle w:val="PlainText"/>
+        <w:rPr>
+          <w:rFonts w:ascii="Courier New" w:hAnsi="Courier New" w:cs="Courier New"/>
+        </w:rPr>
+      </w:pPr>
+      <w:r>
+        <w:rPr>
+          <w:rFonts w:ascii="Courier New" w:hAnsi="Courier New" w:cs="Courier New"/>
+        </w:rPr>
+        <w:tab/>
+        <w:t xml:space="preserve">        420         </w:t>
+      </w:r>
+      <w:r>
+        <w:rPr>
+          <w:rFonts w:ascii="Courier New" w:hAnsi="Courier New" w:cs="Courier New"/>
+        </w:rPr>
+        <w:tab/>
+      </w:r>
+    </w:p>
+    <w:p>
+      <w:pPr>
+        <w:pStyle w:val="PlainText"/>
+        <w:rPr>
+          <w:rFonts w:ascii="Courier New" w:hAnsi="Courier New" w:cs="Courier New"/>
+        </w:rPr>
+      </w:pPr>
+    </w:p>
+    <w:p>
+      <w:pPr>
+        <w:pStyle w:val="PlainText"/>
+        <w:rPr>
+          <w:rFonts w:ascii="Courier New" w:hAnsi="Courier New" w:cs="Courier New"/>
+        </w:rPr>
+      </w:pPr>
+    </w:p>
+    <w:p>
+      <w:pPr>
+        <w:pStyle w:val="PlainText"/>
+        <w:rPr>
+          <w:rFonts w:ascii="Courier New" w:hAnsi="Courier New" w:cs="Courier New"/>
+        </w:rPr>
+      </w:pPr>
+      <w:r>
+        <w:rPr>
+          <w:rFonts w:ascii="Courier New" w:hAnsi="Courier New" w:cs="Courier New"/>
+        </w:rPr>
+        <w:t>ITEM BQ-5543</w:t>
+      </w:r>
+    </w:p>
+    <w:p>
+      <w:pPr>
+        <w:pStyle w:val="PlainText"/>
+        <w:rPr>
+          <w:rFonts w:ascii="Courier New" w:hAnsi="Courier New" w:cs="Courier New"/>
+        </w:rPr>
+      </w:pPr>
+      <w:r>
+        <w:rPr>
+          <w:rFonts w:ascii="Courier New" w:hAnsi="Courier New" w:cs="Courier New"/>
+        </w:rPr>
+        <w:tab/>
+        <w:t>-QUANTITY IN STOCK--</w:t>
+      </w:r>
+      <w:r>
+        <w:rPr>
+          <w:rFonts w:ascii="Courier New" w:hAnsi="Courier New" w:cs="Courier New"/>
+        </w:rPr>
+        <w:tab/>
+        <w:t>-QUANTITY REQUESTED-</w:t>
+      </w:r>
+      <w:r>
+        <w:rPr>
+          <w:rFonts w:ascii="Courier New" w:hAnsi="Courier New" w:cs="Courier New"/>
+        </w:rPr>
+        <w:tab/>
+      </w:r>
+    </w:p>
+    <w:p>
+      <w:pPr>
+        <w:pStyle w:val="PlainText"/>
+        <w:rPr>
+          <w:rFonts w:ascii="Courier New" w:hAnsi="Courier New" w:cs="Courier New"/>
+        </w:rPr>
+      </w:pPr>
+      <w:r>
+        <w:rPr>
+          <w:rFonts w:ascii="Courier New" w:hAnsi="Courier New" w:cs="Courier New"/>
+        </w:rPr>
+        <w:tab/>
+        <w:t xml:space="preserve">         1          </w:t>
+      </w:r>
+      <w:r>
+        <w:rPr>
+          <w:rFonts w:ascii="Courier New" w:hAnsi="Courier New" w:cs="Courier New"/>
+        </w:rPr>
+        <w:tab/>
+        <w:t xml:space="preserve">         2          </w:t>
+      </w:r>
+      <w:r>
+        <w:rPr>
+          <w:rFonts w:ascii="Courier New" w:hAnsi="Courier New" w:cs="Courier New"/>
+        </w:rPr>
+        <w:tab/>
+      </w:r>
+    </w:p>
+    <w:p>
+      <w:pPr>
+        <w:pStyle w:val="PlainText"/>
+        <w:rPr>
+          <w:rFonts w:ascii="Courier New" w:hAnsi="Courier New" w:cs="Courier New"/>
+        </w:rPr>
+      </w:pPr>
+    </w:p>
+    <w:p>
+      <w:pPr>
+        <w:pStyle w:val="PlainText"/>
+        <w:rPr>
+          <w:rFonts w:ascii="Courier New" w:hAnsi="Courier New" w:cs="Courier New"/>
+        </w:rPr>
+      </w:pPr>
+      <w:r>
+        <w:rPr>
+          <w:rFonts w:ascii="Courier New" w:hAnsi="Courier New" w:cs="Courier New"/>
+        </w:rPr>
+        <w:tab/>
+        <w:t>-----UNIT PRICE-----</w:t>
+      </w:r>
+      <w:r>
+        <w:rPr>
+          <w:rFonts w:ascii="Courier New" w:hAnsi="Courier New" w:cs="Courier New"/>
+        </w:rPr>
+        <w:tab/>
+        <w:t>-------VENDOR-------</w:t>
+      </w:r>
+      <w:r>
+        <w:rPr>
+          <w:rFonts w:ascii="Courier New" w:hAnsi="Courier New" w:cs="Courier New"/>
+        </w:rPr>
+        <w:tab/>
+      </w:r>
+    </w:p>
+    <w:p>
+      <w:pPr>
+        <w:pStyle w:val="PlainText"/>
+        <w:rPr>
+          <w:rFonts w:ascii="Courier New" w:hAnsi="Courier New" w:cs="Courier New"/>
+        </w:rPr>
+      </w:pPr>
+      <w:r>
+        <w:rPr>
+          <w:rFonts w:ascii="Courier New" w:hAnsi="Courier New" w:cs="Courier New"/>
+        </w:rPr>
+        <w:tab/>
+        <w:t xml:space="preserve">         85         </w:t>
+      </w:r>
+      <w:r>
+        <w:rPr>
+          <w:rFonts w:ascii="Courier New" w:hAnsi="Courier New" w:cs="Courier New"/>
+        </w:rPr>
+        <w:tab/>
+        <w:t xml:space="preserve">       Bosch        </w:t>
+      </w:r>
+      <w:r>
+        <w:rPr>
+          <w:rFonts w:ascii="Courier New" w:hAnsi="Courier New" w:cs="Courier New"/>
+        </w:rPr>
+        <w:tab/>
+      </w:r>
+    </w:p>
+    <w:p>
+      <w:pPr>
+        <w:pStyle w:val="PlainText"/>
+        <w:rPr>
+          <w:rFonts w:ascii="Courier New" w:hAnsi="Courier New" w:cs="Courier New"/>
+        </w:rPr>
+      </w:pPr>
+    </w:p>
+    <w:p>
+      <w:pPr>
+        <w:pStyle w:val="PlainText"/>
+        <w:rPr>
+          <w:rFonts w:ascii="Courier New" w:hAnsi="Courier New" w:cs="Courier New"/>
+        </w:rPr>
+      </w:pPr>
+      <w:r>
+        <w:rPr>
+          <w:rFonts w:ascii="Courier New" w:hAnsi="Courier New" w:cs="Courier New"/>
+        </w:rPr>
+        <w:tab/>
+        <w:t>--LAST INVENTORIED--</w:t>
+      </w:r>
+      <w:r>
+        <w:rPr>
+          <w:rFonts w:ascii="Courier New" w:hAnsi="Courier New" w:cs="Courier New"/>
+        </w:rPr>
+        <w:tab/>
+        <w:t>ORDER SIZE IN UNITS-</w:t>
+      </w:r>
+      <w:r>
+        <w:rPr>
+          <w:rFonts w:ascii="Courier New" w:hAnsi="Courier New" w:cs="Courier New"/>
+        </w:rPr>
+        <w:tab/>
+      </w:r>
+    </w:p>
+    <w:p>
+      <w:pPr>
+        <w:pStyle w:val="PlainText"/>
+        <w:rPr>
+          <w:rFonts w:ascii="Courier New" w:hAnsi="Courier New" w:cs="Courier New"/>
+        </w:rPr>
+      </w:pPr>
+      <w:r>
+        <w:rPr>
+          <w:rFonts w:ascii="Courier New" w:hAnsi="Courier New" w:cs="Courier New"/>
+        </w:rPr>
+        <w:tab/>
+        <w:t xml:space="preserve">  2025-10-16 20:22  </w:t>
+      </w:r>
+      <w:r>
+        <w:rPr>
+          <w:rFonts w:ascii="Courier New" w:hAnsi="Courier New" w:cs="Courier New"/>
+        </w:rPr>
+        <w:tab/>
+        <w:t xml:space="preserve">         5          </w:t>
+      </w:r>
+      <w:r>
+        <w:rPr>
+          <w:rFonts w:ascii="Courier New" w:hAnsi="Courier New" w:cs="Courier New"/>
+        </w:rPr>
+        <w:tab/>
+      </w:r>
+    </w:p>
+    <w:p>
+      <w:pPr>
+        <w:pStyle w:val="PlainText"/>
+        <w:rPr>
+          <w:rFonts w:ascii="Courier New" w:hAnsi="Courier New" w:cs="Courier New"/>
+        </w:rPr>
+      </w:pPr>
+    </w:p>
+    <w:p>
+      <w:pPr>
+        <w:pStyle w:val="PlainText"/>
+        <w:rPr>
+          <w:rFonts w:ascii="Courier New" w:hAnsi="Courier New" w:cs="Courier New"/>
+        </w:rPr>
+      </w:pPr>
+      <w:r>
+        <w:rPr>
+          <w:rFonts w:ascii="Courier New" w:hAnsi="Courier New" w:cs="Courier New"/>
+        </w:rPr>
+        <w:tab/>
+        <w:t>---QUANTITY SHORT---</w:t>
+      </w:r>
+      <w:r>
+        <w:rPr>
+          <w:rFonts w:ascii="Courier New" w:hAnsi="Courier New" w:cs="Courier New"/>
+        </w:rPr>
+        <w:tab/>
+        <w:t>-QUANTITY TO ORDER--</w:t>
+      </w:r>
+      <w:r>
+        <w:rPr>
+          <w:rFonts w:ascii="Courier New" w:hAnsi="Courier New" w:cs="Courier New"/>
+        </w:rPr>
+        <w:tab/>
+      </w:r>
+    </w:p>
+    <w:p>
+      <w:pPr>
+        <w:pStyle w:val="PlainText"/>
+        <w:rPr>
+          <w:rFonts w:ascii="Courier New" w:hAnsi="Courier New" w:cs="Courier New"/>
+        </w:rPr>
+      </w:pPr>
+      <w:r>
+        <w:rPr>
+          <w:rFonts w:ascii="Courier New" w:hAnsi="Courier New" w:cs="Courier New"/>
+        </w:rPr>
+        <w:tab/>
+        <w:t xml:space="preserve">         1          </w:t>
+      </w:r>
+      <w:r>
+        <w:rPr>
+          <w:rFonts w:ascii="Courier New" w:hAnsi="Courier New" w:cs="Courier New"/>
+        </w:rPr>
+        <w:tab/>
+        <w:t xml:space="preserve">         5          </w:t>
+      </w:r>
+      <w:r>
+        <w:rPr>
+          <w:rFonts w:ascii="Courier New" w:hAnsi="Courier New" w:cs="Courier New"/>
+        </w:rPr>
+        <w:tab/>
+      </w:r>
+    </w:p>
+    <w:p>
+      <w:pPr>
+        <w:pStyle w:val="PlainText"/>
+        <w:rPr>
+          <w:rFonts w:ascii="Courier New" w:hAnsi="Courier New" w:cs="Courier New"/>
+        </w:rPr>
+      </w:pPr>
+    </w:p>
+    <w:p>
+      <w:pPr>
+        <w:pStyle w:val="PlainText"/>
+        <w:rPr>
+          <w:rFonts w:ascii="Courier New" w:hAnsi="Courier New" w:cs="Courier New"/>
+        </w:rPr>
+      </w:pPr>
+      <w:r>
+        <w:rPr>
+          <w:rFonts w:ascii="Courier New" w:hAnsi="Courier New" w:cs="Courier New"/>
+        </w:rPr>
+        <w:tab/>
+        <w:t>--NEXT ORDER COST---</w:t>
+      </w:r>
+      <w:r>
+        <w:rPr>
+          <w:rFonts w:ascii="Courier New" w:hAnsi="Courier New" w:cs="Courier New"/>
+        </w:rPr>
+        <w:tab/>
+      </w:r>
+    </w:p>
+    <w:p>
+      <w:pPr>
+        <w:pStyle w:val="PlainText"/>
+        <w:rPr>
+          <w:rFonts w:ascii="Courier New" w:hAnsi="Courier New" w:cs="Courier New"/>
+        </w:rPr>
+      </w:pPr>
+      <w:r>
+        <w:rPr>
+          <w:rFonts w:ascii="Courier New" w:hAnsi="Courier New" w:cs="Courier New"/>
+        </w:rPr>
+        <w:tab/>
+        <w:t xml:space="preserve">        425         </w:t>
+      </w:r>
+      <w:r>
+        <w:rPr>
+          <w:rFonts w:ascii="Courier New" w:hAnsi="Courier New" w:cs="Courier New"/>
+        </w:rPr>
+        <w:tab/>
+      </w:r>
+    </w:p>
+    <w:p>
+      <w:pPr>
+        <w:pStyle w:val="PlainText"/>
+        <w:rPr>
+          <w:rFonts w:ascii="Courier New" w:hAnsi="Courier New" w:cs="Courier New"/>
+        </w:rPr>
+      </w:pPr>
+    </w:p>
+    <w:p>
+      <w:pPr>
+        <w:pStyle w:val="PlainText"/>
+        <w:rPr>
+          <w:rFonts w:ascii="Courier New" w:hAnsi="Courier New" w:cs="Courier New"/>
+        </w:rPr>
+      </w:pPr>
+    </w:p>
+    <w:p>
+      <w:pPr>
+        <w:rPr>
+          <w:b/>
+          <w:bCs/>
+        </w:rPr>
+      </w:pPr>
     </w:p>
     <w:sectPr>
       <w:pgSz w:w="12240" w:h="15840"/>
@@ -1640,7 +3981,6 @@
   <w:style w:type="character" w:default="1" w:styleId="DefaultParagraphFont">
     <w:name w:val="Default Paragraph Font"/>
     <w:uiPriority w:val="1"/>
-    <w:semiHidden/>
     <w:unhideWhenUsed/>
   </w:style>
   <w:style w:type="table" w:default="1" w:styleId="TableNormal">
@@ -1693,6 +4033,38 @@
         <w:insideV w:val="single" w:sz="4" w:space="0" w:color="auto"/>
       </w:tblBorders>
     </w:tblPr>
+  </w:style>
+  <w:style w:type="paragraph" w:styleId="PlainText">
+    <w:name w:val="Plain Text"/>
+    <w:basedOn w:val="Normal"/>
+    <w:link w:val="PlainTextChar"/>
+    <w:uiPriority w:val="99"/>
+    <w:unhideWhenUsed/>
+    <w:rsid w:val="00A724C9"/>
+    <w:pPr>
+      <w:spacing w:after="0" w:line="240" w:lineRule="auto"/>
+    </w:pPr>
+    <w:rPr>
+      <w:rFonts w:ascii="Consolas" w:hAnsi="Consolas" w:cs="Times New Roman"/>
+      <w:kern w:val="2"/>
+      <w:sz w:val="21"/>
+      <w:szCs w:val="21"/>
+      <w14:ligatures w14:val="standardContextual"/>
+    </w:rPr>
+  </w:style>
+  <w:style w:type="character" w:customStyle="1" w:styleId="PlainTextChar">
+    <w:name w:val="Plain Text Char"/>
+    <w:basedOn w:val="DefaultParagraphFont"/>
+    <w:link w:val="PlainText"/>
+    <w:uiPriority w:val="99"/>
+    <w:rsid w:val="00A724C9"/>
+    <w:rPr>
+      <w:rFonts w:ascii="Consolas" w:hAnsi="Consolas" w:cs="Times New Roman"/>
+      <w:kern w:val="2"/>
+      <w:sz w:val="21"/>
+      <w:szCs w:val="21"/>
+      <w14:ligatures w14:val="standardContextual"/>
+    </w:rPr>
   </w:style>
 </w:styles>
 </file>

</xml_diff>